<commit_message>
Update FE-T2-02 QA report based on review feedback
Updated the QA report to address the requested changes and improve the regression testing documentation.
</commit_message>
<xml_diff>
--- a/FE-T2-02_QA_Report.docx
+++ b/FE-T2-02_QA_Report.docx
@@ -100,13 +100,13 @@
         <w:tblLook w:val="0000" w:firstRow="0" w:lastRow="0" w:firstColumn="0" w:lastColumn="0" w:noHBand="0" w:noVBand="0"/>
       </w:tblPr>
       <w:tblGrid>
-        <w:gridCol w:w="700"/>
-        <w:gridCol w:w="1411"/>
-        <w:gridCol w:w="1474"/>
-        <w:gridCol w:w="1134"/>
-        <w:gridCol w:w="1134"/>
-        <w:gridCol w:w="4139"/>
-        <w:gridCol w:w="1361"/>
+        <w:gridCol w:w="697"/>
+        <w:gridCol w:w="1393"/>
+        <w:gridCol w:w="1472"/>
+        <w:gridCol w:w="1116"/>
+        <w:gridCol w:w="1116"/>
+        <w:gridCol w:w="4093"/>
+        <w:gridCol w:w="1466"/>
       </w:tblGrid>
       <w:tr>
         <w:trPr>
@@ -466,7 +466,7 @@
                 <w:sz w:val="18"/>
                 <w:szCs w:val="18"/>
               </w:rPr>
-              <w:t>Work</w:t>
+              <w:t>Works</w:t>
             </w:r>
           </w:p>
         </w:tc>
@@ -1354,7 +1354,7 @@
                 <w:sz w:val="18"/>
                 <w:szCs w:val="18"/>
               </w:rPr>
-              <w:t>Web &amp; mobile : Account can’t create</w:t>
+              <w:t>Web &amp; mobile : Account can’t create Handover-doc mismatch: sign-up was expected to work per the handover/feature set; live testing found account creation broken on both platforms.</w:t>
             </w:r>
           </w:p>
         </w:tc>
@@ -2887,7 +2887,7 @@
                 <w:sz w:val="18"/>
                 <w:szCs w:val="18"/>
               </w:rPr>
-              <w:t xml:space="preserve">Mobile: No specipic page for weekly plan </w:t>
+              <w:t xml:space="preserve">Mobile: No specific page for weekly plan </w:t>
             </w:r>
           </w:p>
         </w:tc>
@@ -3213,7 +3213,7 @@
                 <w:sz w:val="18"/>
                 <w:szCs w:val="18"/>
               </w:rPr>
-              <w:t>Mobile: Not working</w:t>
+              <w:t>Mobile: Not working Handover-doc mismatch: AI personalised plan was expected to work; found broken on mobile.</w:t>
             </w:r>
           </w:p>
         </w:tc>
@@ -3465,7 +3465,7 @@
                 <w:sz w:val="18"/>
                 <w:szCs w:val="18"/>
               </w:rPr>
-              <w:t>Mobile: Not working</w:t>
+              <w:t>Mobile: Not working Handover-doc mismatch: save/reopen was expected to persist; found broken on mobile.</w:t>
             </w:r>
           </w:p>
         </w:tc>
@@ -3493,7 +3493,6 @@
           <w:bCs/>
           <w:color w:val="6B4E9E"/>
         </w:rPr>
-        <w:lastRenderedPageBreak/>
         <w:t>3 Recipes</w:t>
       </w:r>
     </w:p>
@@ -4132,7 +4131,7 @@
                 <w:sz w:val="18"/>
                 <w:szCs w:val="18"/>
               </w:rPr>
-              <w:t>Mobile: Image preview is no visible</w:t>
+              <w:t>Mobile: Image preview is not visible</w:t>
             </w:r>
           </w:p>
         </w:tc>
@@ -4458,7 +4457,7 @@
                 <w:sz w:val="18"/>
                 <w:szCs w:val="18"/>
               </w:rPr>
-              <w:t>Mobile: Image preview is no visible</w:t>
+              <w:t>Mobile: Image preview is not visible</w:t>
             </w:r>
           </w:p>
         </w:tc>
@@ -5167,7 +5166,6 @@
           <w:bCs/>
           <w:color w:val="6B4E9E"/>
         </w:rPr>
-        <w:lastRenderedPageBreak/>
         <w:t>4 Scan</w:t>
       </w:r>
     </w:p>
@@ -5756,7 +5754,7 @@
                 <w:sz w:val="18"/>
                 <w:szCs w:val="18"/>
               </w:rPr>
-              <w:t>Mobile: Scan tab (BarcodeScanner)</w:t>
+              <w:t>Mobile: Scan tab (BarcodeScanner) Handover-doc mismatch: Scan was presented as an available feature; found broken on both platforms.</w:t>
             </w:r>
           </w:p>
         </w:tc>
@@ -6082,7 +6080,7 @@
                 <w:sz w:val="18"/>
                 <w:szCs w:val="18"/>
               </w:rPr>
-              <w:t>Mobile: ScanProductScreen</w:t>
+              <w:t>Mobile: ScanProductScreen Handover-doc mismatch: scan-result nutrition display was expected to work; found broken on both platforms.</w:t>
             </w:r>
           </w:p>
         </w:tc>
@@ -7138,7 +7136,7 @@
           <w:bCs/>
           <w:color w:val="6B4E9E"/>
         </w:rPr>
-        <w:t>s6 Admin</w:t>
+        <w:t>6 Admin</w:t>
       </w:r>
     </w:p>
     <w:tbl>
@@ -7852,6 +7850,14 @@
     </w:tbl>
     <w:p/>
     <w:p/>
+    <w:p/>
+    <w:p/>
+    <w:p/>
+    <w:p/>
+    <w:p/>
+    <w:p/>
+    <w:p/>
+    <w:p/>
     <w:p>
       <w:pPr>
         <w:rPr>
@@ -7872,6 +7878,7 @@
           <w:sz w:val="24"/>
           <w:szCs w:val="24"/>
         </w:rPr>
+        <w:lastRenderedPageBreak/>
         <w:t>Defect log</w:t>
       </w:r>
     </w:p>
@@ -7885,7 +7892,7 @@
     </w:p>
     <w:tbl>
       <w:tblPr>
-        <w:tblW w:w="9200" w:type="dxa"/>
+        <w:tblW w:w="9672" w:type="dxa"/>
         <w:tblBorders>
           <w:top w:val="single" w:sz="4" w:space="0" w:color="auto"/>
           <w:left w:val="single" w:sz="4" w:space="0" w:color="auto"/>
@@ -7901,11 +7908,11 @@
         <w:tblLook w:val="0000" w:firstRow="0" w:lastRow="0" w:firstColumn="0" w:lastColumn="0" w:noHBand="0" w:noVBand="0"/>
       </w:tblPr>
       <w:tblGrid>
-        <w:gridCol w:w="720"/>
-        <w:gridCol w:w="1713"/>
-        <w:gridCol w:w="1032"/>
-        <w:gridCol w:w="4081"/>
-        <w:gridCol w:w="1654"/>
+        <w:gridCol w:w="671"/>
+        <w:gridCol w:w="1739"/>
+        <w:gridCol w:w="1026"/>
+        <w:gridCol w:w="5102"/>
+        <w:gridCol w:w="1134"/>
       </w:tblGrid>
       <w:tr>
         <w:trPr>
@@ -7913,7 +7920,7 @@
         </w:trPr>
         <w:tc>
           <w:tcPr>
-            <w:tcW w:w="820" w:type="dxa"/>
+            <w:tcW w:w="671" w:type="dxa"/>
             <w:tcBorders>
               <w:top w:val="single" w:sz="4" w:space="0" w:color="BFBFBF"/>
               <w:left w:val="single" w:sz="4" w:space="0" w:color="BFBFBF"/>
@@ -7927,8 +7934,12 @@
               <w:bottom w:w="40" w:type="dxa"/>
               <w:right w:w="80" w:type="dxa"/>
             </w:tcMar>
-          </w:tcPr>
-          <w:p>
+            <w:vAlign w:val="center"/>
+          </w:tcPr>
+          <w:p>
+            <w:pPr>
+              <w:jc w:val="center"/>
+            </w:pPr>
             <w:r>
               <w:rPr>
                 <w:b/>
@@ -7943,7 +7954,7 @@
         </w:tc>
         <w:tc>
           <w:tcPr>
-            <w:tcW w:w="1900" w:type="dxa"/>
+            <w:tcW w:w="1739" w:type="dxa"/>
             <w:tcBorders>
               <w:top w:val="single" w:sz="4" w:space="0" w:color="BFBFBF"/>
               <w:left w:val="single" w:sz="4" w:space="0" w:color="BFBFBF"/>
@@ -7957,8 +7968,12 @@
               <w:bottom w:w="40" w:type="dxa"/>
               <w:right w:w="80" w:type="dxa"/>
             </w:tcMar>
-          </w:tcPr>
-          <w:p>
+            <w:vAlign w:val="center"/>
+          </w:tcPr>
+          <w:p>
+            <w:pPr>
+              <w:jc w:val="center"/>
+            </w:pPr>
             <w:r>
               <w:rPr>
                 <w:b/>
@@ -7973,7 +7988,7 @@
         </w:tc>
         <w:tc>
           <w:tcPr>
-            <w:tcW w:w="1100" w:type="dxa"/>
+            <w:tcW w:w="1026" w:type="dxa"/>
             <w:tcBorders>
               <w:top w:val="single" w:sz="4" w:space="0" w:color="BFBFBF"/>
               <w:left w:val="single" w:sz="4" w:space="0" w:color="BFBFBF"/>
@@ -7987,8 +8002,12 @@
               <w:bottom w:w="40" w:type="dxa"/>
               <w:right w:w="80" w:type="dxa"/>
             </w:tcMar>
-          </w:tcPr>
-          <w:p>
+            <w:vAlign w:val="center"/>
+          </w:tcPr>
+          <w:p>
+            <w:pPr>
+              <w:jc w:val="center"/>
+            </w:pPr>
             <w:r>
               <w:rPr>
                 <w:b/>
@@ -8003,7 +8022,7 @@
         </w:tc>
         <w:tc>
           <w:tcPr>
-            <w:tcW w:w="3480" w:type="dxa"/>
+            <w:tcW w:w="5102" w:type="dxa"/>
             <w:tcBorders>
               <w:top w:val="single" w:sz="4" w:space="0" w:color="BFBFBF"/>
               <w:left w:val="single" w:sz="4" w:space="0" w:color="BFBFBF"/>
@@ -8017,8 +8036,12 @@
               <w:bottom w:w="40" w:type="dxa"/>
               <w:right w:w="80" w:type="dxa"/>
             </w:tcMar>
-          </w:tcPr>
-          <w:p>
+            <w:vAlign w:val="center"/>
+          </w:tcPr>
+          <w:p>
+            <w:pPr>
+              <w:jc w:val="center"/>
+            </w:pPr>
             <w:r>
               <w:rPr>
                 <w:b/>
@@ -8033,7 +8056,7 @@
         </w:tc>
         <w:tc>
           <w:tcPr>
-            <w:tcW w:w="1900" w:type="dxa"/>
+            <w:tcW w:w="1134" w:type="dxa"/>
             <w:tcBorders>
               <w:top w:val="single" w:sz="4" w:space="0" w:color="BFBFBF"/>
               <w:left w:val="single" w:sz="4" w:space="0" w:color="BFBFBF"/>
@@ -8047,8 +8070,12 @@
               <w:bottom w:w="40" w:type="dxa"/>
               <w:right w:w="80" w:type="dxa"/>
             </w:tcMar>
-          </w:tcPr>
-          <w:p>
+            <w:vAlign w:val="center"/>
+          </w:tcPr>
+          <w:p>
+            <w:pPr>
+              <w:jc w:val="center"/>
+            </w:pPr>
             <w:r>
               <w:rPr>
                 <w:b/>
@@ -8065,7 +8092,7 @@
       <w:tr>
         <w:tc>
           <w:tcPr>
-            <w:tcW w:w="820" w:type="dxa"/>
+            <w:tcW w:w="671" w:type="dxa"/>
             <w:tcBorders>
               <w:top w:val="single" w:sz="4" w:space="0" w:color="BFBFBF"/>
               <w:left w:val="single" w:sz="4" w:space="0" w:color="BFBFBF"/>
@@ -8079,8 +8106,12 @@
               <w:bottom w:w="40" w:type="dxa"/>
               <w:right w:w="80" w:type="dxa"/>
             </w:tcMar>
-          </w:tcPr>
-          <w:p>
+            <w:vAlign w:val="center"/>
+          </w:tcPr>
+          <w:p>
+            <w:pPr>
+              <w:jc w:val="center"/>
+            </w:pPr>
             <w:r>
               <w:rPr>
                 <w:color w:val="000000"/>
@@ -8093,7 +8124,7 @@
         </w:tc>
         <w:tc>
           <w:tcPr>
-            <w:tcW w:w="1900" w:type="dxa"/>
+            <w:tcW w:w="1739" w:type="dxa"/>
             <w:tcBorders>
               <w:top w:val="single" w:sz="4" w:space="0" w:color="BFBFBF"/>
               <w:left w:val="single" w:sz="4" w:space="0" w:color="BFBFBF"/>
@@ -8107,8 +8138,12 @@
               <w:bottom w:w="40" w:type="dxa"/>
               <w:right w:w="80" w:type="dxa"/>
             </w:tcMar>
-          </w:tcPr>
-          <w:p>
+            <w:vAlign w:val="center"/>
+          </w:tcPr>
+          <w:p>
+            <w:pPr>
+              <w:jc w:val="center"/>
+            </w:pPr>
             <w:r>
               <w:rPr>
                 <w:color w:val="000000"/>
@@ -8121,7 +8156,7 @@
         </w:tc>
         <w:tc>
           <w:tcPr>
-            <w:tcW w:w="1100" w:type="dxa"/>
+            <w:tcW w:w="1026" w:type="dxa"/>
             <w:tcBorders>
               <w:top w:val="single" w:sz="4" w:space="0" w:color="BFBFBF"/>
               <w:left w:val="single" w:sz="4" w:space="0" w:color="BFBFBF"/>
@@ -8135,8 +8170,12 @@
               <w:bottom w:w="40" w:type="dxa"/>
               <w:right w:w="80" w:type="dxa"/>
             </w:tcMar>
-          </w:tcPr>
-          <w:p>
+            <w:vAlign w:val="center"/>
+          </w:tcPr>
+          <w:p>
+            <w:pPr>
+              <w:jc w:val="center"/>
+            </w:pPr>
             <w:r>
               <w:rPr>
                 <w:color w:val="000000"/>
@@ -8149,7 +8188,7 @@
         </w:tc>
         <w:tc>
           <w:tcPr>
-            <w:tcW w:w="3480" w:type="dxa"/>
+            <w:tcW w:w="5102" w:type="dxa"/>
             <w:tcBorders>
               <w:top w:val="single" w:sz="4" w:space="0" w:color="BFBFBF"/>
               <w:left w:val="single" w:sz="4" w:space="0" w:color="BFBFBF"/>
@@ -8163,30 +8202,22 @@
               <w:bottom w:w="40" w:type="dxa"/>
               <w:right w:w="80" w:type="dxa"/>
             </w:tcMar>
-          </w:tcPr>
-          <w:p>
-            <w:r>
-              <w:rPr>
-                <w:color w:val="000000"/>
-                <w:sz w:val="18"/>
-                <w:szCs w:val="18"/>
-              </w:rPr>
-              <w:t xml:space="preserve">All Community routes (Feed, Post detail, Create post, Leaderboard) render a shared “Coming soon” placeholder and Community is not in the tab bar - </w:t>
-            </w:r>
-            <w:r>
-              <w:rPr>
-                <w:color w:val="000000"/>
-                <w:sz w:val="18"/>
-                <w:szCs w:val="18"/>
-              </w:rPr>
-              <w:lastRenderedPageBreak/>
-              <w:t>feature not implemented on mobile. Handover implied Community was present on mobile — contradicted (regression). CommunityStack is not mounted in any navigator, so Community is completely unreachable on mobile.</w:t>
-            </w:r>
-          </w:p>
-        </w:tc>
-        <w:tc>
-          <w:tcPr>
-            <w:tcW w:w="1900" w:type="dxa"/>
+            <w:vAlign w:val="center"/>
+          </w:tcPr>
+          <w:p>
+            <w:r>
+              <w:rPr>
+                <w:color w:val="000000"/>
+                <w:sz w:val="18"/>
+                <w:szCs w:val="18"/>
+              </w:rPr>
+              <w:t>All Community routes (Feed, Post detail, Create post, Leaderboard) render a shared “Coming soon” placeholder and Community is not in the tab bar - feature not implemented on mobile. Handover implied Community was present on mobile — contradicted (regression). CommunityStack is not mounted in any navigator, so Community is completely unreachable on mobile.</w:t>
+            </w:r>
+          </w:p>
+        </w:tc>
+        <w:tc>
+          <w:tcPr>
+            <w:tcW w:w="1134" w:type="dxa"/>
             <w:tcBorders>
               <w:top w:val="single" w:sz="4" w:space="0" w:color="BFBFBF"/>
               <w:left w:val="single" w:sz="4" w:space="0" w:color="BFBFBF"/>
@@ -8200,15 +8231,18 @@
               <w:bottom w:w="40" w:type="dxa"/>
               <w:right w:w="80" w:type="dxa"/>
             </w:tcMar>
-          </w:tcPr>
-          <w:p>
-            <w:r>
-              <w:rPr>
-                <w:color w:val="000000"/>
-                <w:sz w:val="18"/>
-                <w:szCs w:val="18"/>
-              </w:rPr>
-              <w:lastRenderedPageBreak/>
+            <w:vAlign w:val="center"/>
+          </w:tcPr>
+          <w:p>
+            <w:pPr>
+              <w:jc w:val="center"/>
+            </w:pPr>
+            <w:r>
+              <w:rPr>
+                <w:color w:val="000000"/>
+                <w:sz w:val="18"/>
+                <w:szCs w:val="18"/>
+              </w:rPr>
               <w:t>Open</w:t>
             </w:r>
           </w:p>
@@ -8217,21 +8251,25 @@
       <w:tr>
         <w:tc>
           <w:tcPr>
-            <w:tcW w:w="820" w:type="dxa"/>
-            <w:tcBorders>
-              <w:top w:val="single" w:sz="4" w:space="0" w:color="BFBFBF"/>
-              <w:left w:val="single" w:sz="4" w:space="0" w:color="BFBFBF"/>
-              <w:bottom w:val="single" w:sz="4" w:space="0" w:color="BFBFBF"/>
-              <w:right w:val="single" w:sz="4" w:space="0" w:color="BFBFBF"/>
-            </w:tcBorders>
-            <w:tcMar>
-              <w:top w:w="40" w:type="dxa"/>
-              <w:left w:w="80" w:type="dxa"/>
-              <w:bottom w:w="40" w:type="dxa"/>
-              <w:right w:w="80" w:type="dxa"/>
-            </w:tcMar>
-          </w:tcPr>
-          <w:p>
+            <w:tcW w:w="671" w:type="dxa"/>
+            <w:tcBorders>
+              <w:top w:val="single" w:sz="4" w:space="0" w:color="BFBFBF"/>
+              <w:left w:val="single" w:sz="4" w:space="0" w:color="BFBFBF"/>
+              <w:bottom w:val="single" w:sz="4" w:space="0" w:color="BFBFBF"/>
+              <w:right w:val="single" w:sz="4" w:space="0" w:color="BFBFBF"/>
+            </w:tcBorders>
+            <w:tcMar>
+              <w:top w:w="40" w:type="dxa"/>
+              <w:left w:w="80" w:type="dxa"/>
+              <w:bottom w:w="40" w:type="dxa"/>
+              <w:right w:w="80" w:type="dxa"/>
+            </w:tcMar>
+            <w:vAlign w:val="center"/>
+          </w:tcPr>
+          <w:p>
+            <w:pPr>
+              <w:jc w:val="center"/>
+            </w:pPr>
             <w:r>
               <w:rPr>
                 <w:color w:val="000000"/>
@@ -8244,21 +8282,25 @@
         </w:tc>
         <w:tc>
           <w:tcPr>
-            <w:tcW w:w="1900" w:type="dxa"/>
-            <w:tcBorders>
-              <w:top w:val="single" w:sz="4" w:space="0" w:color="BFBFBF"/>
-              <w:left w:val="single" w:sz="4" w:space="0" w:color="BFBFBF"/>
-              <w:bottom w:val="single" w:sz="4" w:space="0" w:color="BFBFBF"/>
-              <w:right w:val="single" w:sz="4" w:space="0" w:color="BFBFBF"/>
-            </w:tcBorders>
-            <w:tcMar>
-              <w:top w:w="40" w:type="dxa"/>
-              <w:left w:w="80" w:type="dxa"/>
-              <w:bottom w:w="40" w:type="dxa"/>
-              <w:right w:w="80" w:type="dxa"/>
-            </w:tcMar>
-          </w:tcPr>
-          <w:p>
+            <w:tcW w:w="1739" w:type="dxa"/>
+            <w:tcBorders>
+              <w:top w:val="single" w:sz="4" w:space="0" w:color="BFBFBF"/>
+              <w:left w:val="single" w:sz="4" w:space="0" w:color="BFBFBF"/>
+              <w:bottom w:val="single" w:sz="4" w:space="0" w:color="BFBFBF"/>
+              <w:right w:val="single" w:sz="4" w:space="0" w:color="BFBFBF"/>
+            </w:tcBorders>
+            <w:tcMar>
+              <w:top w:w="40" w:type="dxa"/>
+              <w:left w:w="80" w:type="dxa"/>
+              <w:bottom w:w="40" w:type="dxa"/>
+              <w:right w:w="80" w:type="dxa"/>
+            </w:tcMar>
+            <w:vAlign w:val="center"/>
+          </w:tcPr>
+          <w:p>
+            <w:pPr>
+              <w:jc w:val="center"/>
+            </w:pPr>
             <w:r>
               <w:rPr>
                 <w:color w:val="000000"/>
@@ -8271,21 +8313,25 @@
         </w:tc>
         <w:tc>
           <w:tcPr>
-            <w:tcW w:w="1100" w:type="dxa"/>
-            <w:tcBorders>
-              <w:top w:val="single" w:sz="4" w:space="0" w:color="BFBFBF"/>
-              <w:left w:val="single" w:sz="4" w:space="0" w:color="BFBFBF"/>
-              <w:bottom w:val="single" w:sz="4" w:space="0" w:color="BFBFBF"/>
-              <w:right w:val="single" w:sz="4" w:space="0" w:color="BFBFBF"/>
-            </w:tcBorders>
-            <w:tcMar>
-              <w:top w:w="40" w:type="dxa"/>
-              <w:left w:w="80" w:type="dxa"/>
-              <w:bottom w:w="40" w:type="dxa"/>
-              <w:right w:w="80" w:type="dxa"/>
-            </w:tcMar>
-          </w:tcPr>
-          <w:p>
+            <w:tcW w:w="1026" w:type="dxa"/>
+            <w:tcBorders>
+              <w:top w:val="single" w:sz="4" w:space="0" w:color="BFBFBF"/>
+              <w:left w:val="single" w:sz="4" w:space="0" w:color="BFBFBF"/>
+              <w:bottom w:val="single" w:sz="4" w:space="0" w:color="BFBFBF"/>
+              <w:right w:val="single" w:sz="4" w:space="0" w:color="BFBFBF"/>
+            </w:tcBorders>
+            <w:tcMar>
+              <w:top w:w="40" w:type="dxa"/>
+              <w:left w:w="80" w:type="dxa"/>
+              <w:bottom w:w="40" w:type="dxa"/>
+              <w:right w:w="80" w:type="dxa"/>
+            </w:tcMar>
+            <w:vAlign w:val="center"/>
+          </w:tcPr>
+          <w:p>
+            <w:pPr>
+              <w:jc w:val="center"/>
+            </w:pPr>
             <w:r>
               <w:rPr>
                 <w:color w:val="000000"/>
@@ -8298,19 +8344,20 @@
         </w:tc>
         <w:tc>
           <w:tcPr>
-            <w:tcW w:w="3480" w:type="dxa"/>
-            <w:tcBorders>
-              <w:top w:val="single" w:sz="4" w:space="0" w:color="BFBFBF"/>
-              <w:left w:val="single" w:sz="4" w:space="0" w:color="BFBFBF"/>
-              <w:bottom w:val="single" w:sz="4" w:space="0" w:color="BFBFBF"/>
-              <w:right w:val="single" w:sz="4" w:space="0" w:color="BFBFBF"/>
-            </w:tcBorders>
-            <w:tcMar>
-              <w:top w:w="40" w:type="dxa"/>
-              <w:left w:w="80" w:type="dxa"/>
-              <w:bottom w:w="40" w:type="dxa"/>
-              <w:right w:w="80" w:type="dxa"/>
-            </w:tcMar>
+            <w:tcW w:w="5102" w:type="dxa"/>
+            <w:tcBorders>
+              <w:top w:val="single" w:sz="4" w:space="0" w:color="BFBFBF"/>
+              <w:left w:val="single" w:sz="4" w:space="0" w:color="BFBFBF"/>
+              <w:bottom w:val="single" w:sz="4" w:space="0" w:color="BFBFBF"/>
+              <w:right w:val="single" w:sz="4" w:space="0" w:color="BFBFBF"/>
+            </w:tcBorders>
+            <w:tcMar>
+              <w:top w:w="40" w:type="dxa"/>
+              <w:left w:w="80" w:type="dxa"/>
+              <w:bottom w:w="40" w:type="dxa"/>
+              <w:right w:w="80" w:type="dxa"/>
+            </w:tcMar>
+            <w:vAlign w:val="center"/>
           </w:tcPr>
           <w:p>
             <w:r>
@@ -8325,21 +8372,25 @@
         </w:tc>
         <w:tc>
           <w:tcPr>
-            <w:tcW w:w="1900" w:type="dxa"/>
-            <w:tcBorders>
-              <w:top w:val="single" w:sz="4" w:space="0" w:color="BFBFBF"/>
-              <w:left w:val="single" w:sz="4" w:space="0" w:color="BFBFBF"/>
-              <w:bottom w:val="single" w:sz="4" w:space="0" w:color="BFBFBF"/>
-              <w:right w:val="single" w:sz="4" w:space="0" w:color="BFBFBF"/>
-            </w:tcBorders>
-            <w:tcMar>
-              <w:top w:w="40" w:type="dxa"/>
-              <w:left w:w="80" w:type="dxa"/>
-              <w:bottom w:w="40" w:type="dxa"/>
-              <w:right w:w="80" w:type="dxa"/>
-            </w:tcMar>
-          </w:tcPr>
-          <w:p>
+            <w:tcW w:w="1134" w:type="dxa"/>
+            <w:tcBorders>
+              <w:top w:val="single" w:sz="4" w:space="0" w:color="BFBFBF"/>
+              <w:left w:val="single" w:sz="4" w:space="0" w:color="BFBFBF"/>
+              <w:bottom w:val="single" w:sz="4" w:space="0" w:color="BFBFBF"/>
+              <w:right w:val="single" w:sz="4" w:space="0" w:color="BFBFBF"/>
+            </w:tcBorders>
+            <w:tcMar>
+              <w:top w:w="40" w:type="dxa"/>
+              <w:left w:w="80" w:type="dxa"/>
+              <w:bottom w:w="40" w:type="dxa"/>
+              <w:right w:w="80" w:type="dxa"/>
+            </w:tcMar>
+            <w:vAlign w:val="center"/>
+          </w:tcPr>
+          <w:p>
+            <w:pPr>
+              <w:jc w:val="center"/>
+            </w:pPr>
             <w:r>
               <w:rPr>
                 <w:color w:val="000000"/>
@@ -8354,7 +8405,7 @@
       <w:tr>
         <w:tc>
           <w:tcPr>
-            <w:tcW w:w="820" w:type="dxa"/>
+            <w:tcW w:w="671" w:type="dxa"/>
             <w:tcBorders>
               <w:top w:val="single" w:sz="4" w:space="0" w:color="BFBFBF"/>
               <w:left w:val="single" w:sz="4" w:space="0" w:color="BFBFBF"/>
@@ -8368,8 +8419,12 @@
               <w:bottom w:w="40" w:type="dxa"/>
               <w:right w:w="80" w:type="dxa"/>
             </w:tcMar>
-          </w:tcPr>
-          <w:p>
+            <w:vAlign w:val="center"/>
+          </w:tcPr>
+          <w:p>
+            <w:pPr>
+              <w:jc w:val="center"/>
+            </w:pPr>
             <w:r>
               <w:rPr>
                 <w:color w:val="000000"/>
@@ -8382,7 +8437,7 @@
         </w:tc>
         <w:tc>
           <w:tcPr>
-            <w:tcW w:w="1900" w:type="dxa"/>
+            <w:tcW w:w="1739" w:type="dxa"/>
             <w:tcBorders>
               <w:top w:val="single" w:sz="4" w:space="0" w:color="BFBFBF"/>
               <w:left w:val="single" w:sz="4" w:space="0" w:color="BFBFBF"/>
@@ -8396,8 +8451,12 @@
               <w:bottom w:w="40" w:type="dxa"/>
               <w:right w:w="80" w:type="dxa"/>
             </w:tcMar>
-          </w:tcPr>
-          <w:p>
+            <w:vAlign w:val="center"/>
+          </w:tcPr>
+          <w:p>
+            <w:pPr>
+              <w:jc w:val="center"/>
+            </w:pPr>
             <w:r>
               <w:rPr>
                 <w:color w:val="000000"/>
@@ -8410,7 +8469,7 @@
         </w:tc>
         <w:tc>
           <w:tcPr>
-            <w:tcW w:w="1100" w:type="dxa"/>
+            <w:tcW w:w="1026" w:type="dxa"/>
             <w:tcBorders>
               <w:top w:val="single" w:sz="4" w:space="0" w:color="BFBFBF"/>
               <w:left w:val="single" w:sz="4" w:space="0" w:color="BFBFBF"/>
@@ -8424,8 +8483,12 @@
               <w:bottom w:w="40" w:type="dxa"/>
               <w:right w:w="80" w:type="dxa"/>
             </w:tcMar>
-          </w:tcPr>
-          <w:p>
+            <w:vAlign w:val="center"/>
+          </w:tcPr>
+          <w:p>
+            <w:pPr>
+              <w:jc w:val="center"/>
+            </w:pPr>
             <w:r>
               <w:rPr>
                 <w:color w:val="000000"/>
@@ -8438,7 +8501,7 @@
         </w:tc>
         <w:tc>
           <w:tcPr>
-            <w:tcW w:w="3480" w:type="dxa"/>
+            <w:tcW w:w="5102" w:type="dxa"/>
             <w:tcBorders>
               <w:top w:val="single" w:sz="4" w:space="0" w:color="BFBFBF"/>
               <w:left w:val="single" w:sz="4" w:space="0" w:color="BFBFBF"/>
@@ -8452,6 +8515,7 @@
               <w:bottom w:w="40" w:type="dxa"/>
               <w:right w:w="80" w:type="dxa"/>
             </w:tcMar>
+            <w:vAlign w:val="center"/>
           </w:tcPr>
           <w:p>
             <w:r>
@@ -8466,7 +8530,7 @@
         </w:tc>
         <w:tc>
           <w:tcPr>
-            <w:tcW w:w="1900" w:type="dxa"/>
+            <w:tcW w:w="1134" w:type="dxa"/>
             <w:tcBorders>
               <w:top w:val="single" w:sz="4" w:space="0" w:color="BFBFBF"/>
               <w:left w:val="single" w:sz="4" w:space="0" w:color="BFBFBF"/>
@@ -8480,8 +8544,12 @@
               <w:bottom w:w="40" w:type="dxa"/>
               <w:right w:w="80" w:type="dxa"/>
             </w:tcMar>
-          </w:tcPr>
-          <w:p>
+            <w:vAlign w:val="center"/>
+          </w:tcPr>
+          <w:p>
+            <w:pPr>
+              <w:jc w:val="center"/>
+            </w:pPr>
             <w:r>
               <w:rPr>
                 <w:color w:val="000000"/>
@@ -8496,21 +8564,25 @@
       <w:tr>
         <w:tc>
           <w:tcPr>
-            <w:tcW w:w="820" w:type="dxa"/>
-            <w:tcBorders>
-              <w:top w:val="single" w:sz="4" w:space="0" w:color="BFBFBF"/>
-              <w:left w:val="single" w:sz="4" w:space="0" w:color="BFBFBF"/>
-              <w:bottom w:val="single" w:sz="4" w:space="0" w:color="BFBFBF"/>
-              <w:right w:val="single" w:sz="4" w:space="0" w:color="BFBFBF"/>
-            </w:tcBorders>
-            <w:tcMar>
-              <w:top w:w="40" w:type="dxa"/>
-              <w:left w:w="80" w:type="dxa"/>
-              <w:bottom w:w="40" w:type="dxa"/>
-              <w:right w:w="80" w:type="dxa"/>
-            </w:tcMar>
-          </w:tcPr>
-          <w:p>
+            <w:tcW w:w="671" w:type="dxa"/>
+            <w:tcBorders>
+              <w:top w:val="single" w:sz="4" w:space="0" w:color="BFBFBF"/>
+              <w:left w:val="single" w:sz="4" w:space="0" w:color="BFBFBF"/>
+              <w:bottom w:val="single" w:sz="4" w:space="0" w:color="BFBFBF"/>
+              <w:right w:val="single" w:sz="4" w:space="0" w:color="BFBFBF"/>
+            </w:tcBorders>
+            <w:tcMar>
+              <w:top w:w="40" w:type="dxa"/>
+              <w:left w:w="80" w:type="dxa"/>
+              <w:bottom w:w="40" w:type="dxa"/>
+              <w:right w:w="80" w:type="dxa"/>
+            </w:tcMar>
+            <w:vAlign w:val="center"/>
+          </w:tcPr>
+          <w:p>
+            <w:pPr>
+              <w:jc w:val="center"/>
+            </w:pPr>
             <w:r>
               <w:rPr>
                 <w:color w:val="000000"/>
@@ -8523,21 +8595,25 @@
         </w:tc>
         <w:tc>
           <w:tcPr>
-            <w:tcW w:w="1900" w:type="dxa"/>
-            <w:tcBorders>
-              <w:top w:val="single" w:sz="4" w:space="0" w:color="BFBFBF"/>
-              <w:left w:val="single" w:sz="4" w:space="0" w:color="BFBFBF"/>
-              <w:bottom w:val="single" w:sz="4" w:space="0" w:color="BFBFBF"/>
-              <w:right w:val="single" w:sz="4" w:space="0" w:color="BFBFBF"/>
-            </w:tcBorders>
-            <w:tcMar>
-              <w:top w:w="40" w:type="dxa"/>
-              <w:left w:w="80" w:type="dxa"/>
-              <w:bottom w:w="40" w:type="dxa"/>
-              <w:right w:w="80" w:type="dxa"/>
-            </w:tcMar>
-          </w:tcPr>
-          <w:p>
+            <w:tcW w:w="1739" w:type="dxa"/>
+            <w:tcBorders>
+              <w:top w:val="single" w:sz="4" w:space="0" w:color="BFBFBF"/>
+              <w:left w:val="single" w:sz="4" w:space="0" w:color="BFBFBF"/>
+              <w:bottom w:val="single" w:sz="4" w:space="0" w:color="BFBFBF"/>
+              <w:right w:val="single" w:sz="4" w:space="0" w:color="BFBFBF"/>
+            </w:tcBorders>
+            <w:tcMar>
+              <w:top w:w="40" w:type="dxa"/>
+              <w:left w:w="80" w:type="dxa"/>
+              <w:bottom w:w="40" w:type="dxa"/>
+              <w:right w:w="80" w:type="dxa"/>
+            </w:tcMar>
+            <w:vAlign w:val="center"/>
+          </w:tcPr>
+          <w:p>
+            <w:pPr>
+              <w:jc w:val="center"/>
+            </w:pPr>
             <w:r>
               <w:rPr>
                 <w:color w:val="000000"/>
@@ -8550,21 +8626,25 @@
         </w:tc>
         <w:tc>
           <w:tcPr>
-            <w:tcW w:w="1100" w:type="dxa"/>
-            <w:tcBorders>
-              <w:top w:val="single" w:sz="4" w:space="0" w:color="BFBFBF"/>
-              <w:left w:val="single" w:sz="4" w:space="0" w:color="BFBFBF"/>
-              <w:bottom w:val="single" w:sz="4" w:space="0" w:color="BFBFBF"/>
-              <w:right w:val="single" w:sz="4" w:space="0" w:color="BFBFBF"/>
-            </w:tcBorders>
-            <w:tcMar>
-              <w:top w:w="40" w:type="dxa"/>
-              <w:left w:w="80" w:type="dxa"/>
-              <w:bottom w:w="40" w:type="dxa"/>
-              <w:right w:w="80" w:type="dxa"/>
-            </w:tcMar>
-          </w:tcPr>
-          <w:p>
+            <w:tcW w:w="1026" w:type="dxa"/>
+            <w:tcBorders>
+              <w:top w:val="single" w:sz="4" w:space="0" w:color="BFBFBF"/>
+              <w:left w:val="single" w:sz="4" w:space="0" w:color="BFBFBF"/>
+              <w:bottom w:val="single" w:sz="4" w:space="0" w:color="BFBFBF"/>
+              <w:right w:val="single" w:sz="4" w:space="0" w:color="BFBFBF"/>
+            </w:tcBorders>
+            <w:tcMar>
+              <w:top w:w="40" w:type="dxa"/>
+              <w:left w:w="80" w:type="dxa"/>
+              <w:bottom w:w="40" w:type="dxa"/>
+              <w:right w:w="80" w:type="dxa"/>
+            </w:tcMar>
+            <w:vAlign w:val="center"/>
+          </w:tcPr>
+          <w:p>
+            <w:pPr>
+              <w:jc w:val="center"/>
+            </w:pPr>
             <w:r>
               <w:rPr>
                 <w:color w:val="000000"/>
@@ -8577,19 +8657,20 @@
         </w:tc>
         <w:tc>
           <w:tcPr>
-            <w:tcW w:w="3480" w:type="dxa"/>
-            <w:tcBorders>
-              <w:top w:val="single" w:sz="4" w:space="0" w:color="BFBFBF"/>
-              <w:left w:val="single" w:sz="4" w:space="0" w:color="BFBFBF"/>
-              <w:bottom w:val="single" w:sz="4" w:space="0" w:color="BFBFBF"/>
-              <w:right w:val="single" w:sz="4" w:space="0" w:color="BFBFBF"/>
-            </w:tcBorders>
-            <w:tcMar>
-              <w:top w:w="40" w:type="dxa"/>
-              <w:left w:w="80" w:type="dxa"/>
-              <w:bottom w:w="40" w:type="dxa"/>
-              <w:right w:w="80" w:type="dxa"/>
-            </w:tcMar>
+            <w:tcW w:w="5102" w:type="dxa"/>
+            <w:tcBorders>
+              <w:top w:val="single" w:sz="4" w:space="0" w:color="BFBFBF"/>
+              <w:left w:val="single" w:sz="4" w:space="0" w:color="BFBFBF"/>
+              <w:bottom w:val="single" w:sz="4" w:space="0" w:color="BFBFBF"/>
+              <w:right w:val="single" w:sz="4" w:space="0" w:color="BFBFBF"/>
+            </w:tcBorders>
+            <w:tcMar>
+              <w:top w:w="40" w:type="dxa"/>
+              <w:left w:w="80" w:type="dxa"/>
+              <w:bottom w:w="40" w:type="dxa"/>
+              <w:right w:w="80" w:type="dxa"/>
+            </w:tcMar>
+            <w:vAlign w:val="center"/>
           </w:tcPr>
           <w:p>
             <w:r>
@@ -8604,21 +8685,25 @@
         </w:tc>
         <w:tc>
           <w:tcPr>
-            <w:tcW w:w="1900" w:type="dxa"/>
-            <w:tcBorders>
-              <w:top w:val="single" w:sz="4" w:space="0" w:color="BFBFBF"/>
-              <w:left w:val="single" w:sz="4" w:space="0" w:color="BFBFBF"/>
-              <w:bottom w:val="single" w:sz="4" w:space="0" w:color="BFBFBF"/>
-              <w:right w:val="single" w:sz="4" w:space="0" w:color="BFBFBF"/>
-            </w:tcBorders>
-            <w:tcMar>
-              <w:top w:w="40" w:type="dxa"/>
-              <w:left w:w="80" w:type="dxa"/>
-              <w:bottom w:w="40" w:type="dxa"/>
-              <w:right w:w="80" w:type="dxa"/>
-            </w:tcMar>
-          </w:tcPr>
-          <w:p>
+            <w:tcW w:w="1134" w:type="dxa"/>
+            <w:tcBorders>
+              <w:top w:val="single" w:sz="4" w:space="0" w:color="BFBFBF"/>
+              <w:left w:val="single" w:sz="4" w:space="0" w:color="BFBFBF"/>
+              <w:bottom w:val="single" w:sz="4" w:space="0" w:color="BFBFBF"/>
+              <w:right w:val="single" w:sz="4" w:space="0" w:color="BFBFBF"/>
+            </w:tcBorders>
+            <w:tcMar>
+              <w:top w:w="40" w:type="dxa"/>
+              <w:left w:w="80" w:type="dxa"/>
+              <w:bottom w:w="40" w:type="dxa"/>
+              <w:right w:w="80" w:type="dxa"/>
+            </w:tcMar>
+            <w:vAlign w:val="center"/>
+          </w:tcPr>
+          <w:p>
+            <w:pPr>
+              <w:jc w:val="center"/>
+            </w:pPr>
             <w:r>
               <w:rPr>
                 <w:color w:val="000000"/>
@@ -8633,7 +8718,7 @@
       <w:tr>
         <w:tc>
           <w:tcPr>
-            <w:tcW w:w="820" w:type="dxa"/>
+            <w:tcW w:w="671" w:type="dxa"/>
             <w:tcBorders>
               <w:top w:val="single" w:sz="4" w:space="0" w:color="BFBFBF"/>
               <w:left w:val="single" w:sz="4" w:space="0" w:color="BFBFBF"/>
@@ -8647,8 +8732,12 @@
               <w:bottom w:w="40" w:type="dxa"/>
               <w:right w:w="80" w:type="dxa"/>
             </w:tcMar>
-          </w:tcPr>
-          <w:p>
+            <w:vAlign w:val="center"/>
+          </w:tcPr>
+          <w:p>
+            <w:pPr>
+              <w:jc w:val="center"/>
+            </w:pPr>
             <w:r>
               <w:rPr>
                 <w:color w:val="000000"/>
@@ -8661,7 +8750,7 @@
         </w:tc>
         <w:tc>
           <w:tcPr>
-            <w:tcW w:w="1900" w:type="dxa"/>
+            <w:tcW w:w="1739" w:type="dxa"/>
             <w:tcBorders>
               <w:top w:val="single" w:sz="4" w:space="0" w:color="BFBFBF"/>
               <w:left w:val="single" w:sz="4" w:space="0" w:color="BFBFBF"/>
@@ -8675,8 +8764,12 @@
               <w:bottom w:w="40" w:type="dxa"/>
               <w:right w:w="80" w:type="dxa"/>
             </w:tcMar>
-          </w:tcPr>
-          <w:p>
+            <w:vAlign w:val="center"/>
+          </w:tcPr>
+          <w:p>
+            <w:pPr>
+              <w:jc w:val="center"/>
+            </w:pPr>
             <w:r>
               <w:rPr>
                 <w:color w:val="000000"/>
@@ -8689,7 +8782,7 @@
         </w:tc>
         <w:tc>
           <w:tcPr>
-            <w:tcW w:w="1100" w:type="dxa"/>
+            <w:tcW w:w="1026" w:type="dxa"/>
             <w:tcBorders>
               <w:top w:val="single" w:sz="4" w:space="0" w:color="BFBFBF"/>
               <w:left w:val="single" w:sz="4" w:space="0" w:color="BFBFBF"/>
@@ -8703,8 +8796,12 @@
               <w:bottom w:w="40" w:type="dxa"/>
               <w:right w:w="80" w:type="dxa"/>
             </w:tcMar>
-          </w:tcPr>
-          <w:p>
+            <w:vAlign w:val="center"/>
+          </w:tcPr>
+          <w:p>
+            <w:pPr>
+              <w:jc w:val="center"/>
+            </w:pPr>
             <w:r>
               <w:rPr>
                 <w:color w:val="000000"/>
@@ -8717,7 +8814,7 @@
         </w:tc>
         <w:tc>
           <w:tcPr>
-            <w:tcW w:w="3480" w:type="dxa"/>
+            <w:tcW w:w="5102" w:type="dxa"/>
             <w:tcBorders>
               <w:top w:val="single" w:sz="4" w:space="0" w:color="BFBFBF"/>
               <w:left w:val="single" w:sz="4" w:space="0" w:color="BFBFBF"/>
@@ -8731,6 +8828,7 @@
               <w:bottom w:w="40" w:type="dxa"/>
               <w:right w:w="80" w:type="dxa"/>
             </w:tcMar>
+            <w:vAlign w:val="center"/>
           </w:tcPr>
           <w:p>
             <w:r>
@@ -8745,7 +8843,7 @@
         </w:tc>
         <w:tc>
           <w:tcPr>
-            <w:tcW w:w="1900" w:type="dxa"/>
+            <w:tcW w:w="1134" w:type="dxa"/>
             <w:tcBorders>
               <w:top w:val="single" w:sz="4" w:space="0" w:color="BFBFBF"/>
               <w:left w:val="single" w:sz="4" w:space="0" w:color="BFBFBF"/>
@@ -8759,8 +8857,12 @@
               <w:bottom w:w="40" w:type="dxa"/>
               <w:right w:w="80" w:type="dxa"/>
             </w:tcMar>
-          </w:tcPr>
-          <w:p>
+            <w:vAlign w:val="center"/>
+          </w:tcPr>
+          <w:p>
+            <w:pPr>
+              <w:jc w:val="center"/>
+            </w:pPr>
             <w:r>
               <w:rPr>
                 <w:color w:val="000000"/>
@@ -8775,21 +8877,25 @@
       <w:tr>
         <w:tc>
           <w:tcPr>
-            <w:tcW w:w="820" w:type="dxa"/>
-            <w:tcBorders>
-              <w:top w:val="single" w:sz="4" w:space="0" w:color="BFBFBF"/>
-              <w:left w:val="single" w:sz="4" w:space="0" w:color="BFBFBF"/>
-              <w:bottom w:val="single" w:sz="4" w:space="0" w:color="BFBFBF"/>
-              <w:right w:val="single" w:sz="4" w:space="0" w:color="BFBFBF"/>
-            </w:tcBorders>
-            <w:tcMar>
-              <w:top w:w="40" w:type="dxa"/>
-              <w:left w:w="80" w:type="dxa"/>
-              <w:bottom w:w="40" w:type="dxa"/>
-              <w:right w:w="80" w:type="dxa"/>
-            </w:tcMar>
-          </w:tcPr>
-          <w:p>
+            <w:tcW w:w="671" w:type="dxa"/>
+            <w:tcBorders>
+              <w:top w:val="single" w:sz="4" w:space="0" w:color="BFBFBF"/>
+              <w:left w:val="single" w:sz="4" w:space="0" w:color="BFBFBF"/>
+              <w:bottom w:val="single" w:sz="4" w:space="0" w:color="BFBFBF"/>
+              <w:right w:val="single" w:sz="4" w:space="0" w:color="BFBFBF"/>
+            </w:tcBorders>
+            <w:tcMar>
+              <w:top w:w="40" w:type="dxa"/>
+              <w:left w:w="80" w:type="dxa"/>
+              <w:bottom w:w="40" w:type="dxa"/>
+              <w:right w:w="80" w:type="dxa"/>
+            </w:tcMar>
+            <w:vAlign w:val="center"/>
+          </w:tcPr>
+          <w:p>
+            <w:pPr>
+              <w:jc w:val="center"/>
+            </w:pPr>
             <w:r>
               <w:rPr>
                 <w:color w:val="000000"/>
@@ -8802,21 +8908,25 @@
         </w:tc>
         <w:tc>
           <w:tcPr>
-            <w:tcW w:w="1900" w:type="dxa"/>
-            <w:tcBorders>
-              <w:top w:val="single" w:sz="4" w:space="0" w:color="BFBFBF"/>
-              <w:left w:val="single" w:sz="4" w:space="0" w:color="BFBFBF"/>
-              <w:bottom w:val="single" w:sz="4" w:space="0" w:color="BFBFBF"/>
-              <w:right w:val="single" w:sz="4" w:space="0" w:color="BFBFBF"/>
-            </w:tcBorders>
-            <w:tcMar>
-              <w:top w:w="40" w:type="dxa"/>
-              <w:left w:w="80" w:type="dxa"/>
-              <w:bottom w:w="40" w:type="dxa"/>
-              <w:right w:w="80" w:type="dxa"/>
-            </w:tcMar>
-          </w:tcPr>
-          <w:p>
+            <w:tcW w:w="1739" w:type="dxa"/>
+            <w:tcBorders>
+              <w:top w:val="single" w:sz="4" w:space="0" w:color="BFBFBF"/>
+              <w:left w:val="single" w:sz="4" w:space="0" w:color="BFBFBF"/>
+              <w:bottom w:val="single" w:sz="4" w:space="0" w:color="BFBFBF"/>
+              <w:right w:val="single" w:sz="4" w:space="0" w:color="BFBFBF"/>
+            </w:tcBorders>
+            <w:tcMar>
+              <w:top w:w="40" w:type="dxa"/>
+              <w:left w:w="80" w:type="dxa"/>
+              <w:bottom w:w="40" w:type="dxa"/>
+              <w:right w:w="80" w:type="dxa"/>
+            </w:tcMar>
+            <w:vAlign w:val="center"/>
+          </w:tcPr>
+          <w:p>
+            <w:pPr>
+              <w:jc w:val="center"/>
+            </w:pPr>
             <w:r>
               <w:rPr>
                 <w:color w:val="000000"/>
@@ -8829,21 +8939,25 @@
         </w:tc>
         <w:tc>
           <w:tcPr>
-            <w:tcW w:w="1100" w:type="dxa"/>
-            <w:tcBorders>
-              <w:top w:val="single" w:sz="4" w:space="0" w:color="BFBFBF"/>
-              <w:left w:val="single" w:sz="4" w:space="0" w:color="BFBFBF"/>
-              <w:bottom w:val="single" w:sz="4" w:space="0" w:color="BFBFBF"/>
-              <w:right w:val="single" w:sz="4" w:space="0" w:color="BFBFBF"/>
-            </w:tcBorders>
-            <w:tcMar>
-              <w:top w:w="40" w:type="dxa"/>
-              <w:left w:w="80" w:type="dxa"/>
-              <w:bottom w:w="40" w:type="dxa"/>
-              <w:right w:w="80" w:type="dxa"/>
-            </w:tcMar>
-          </w:tcPr>
-          <w:p>
+            <w:tcW w:w="1026" w:type="dxa"/>
+            <w:tcBorders>
+              <w:top w:val="single" w:sz="4" w:space="0" w:color="BFBFBF"/>
+              <w:left w:val="single" w:sz="4" w:space="0" w:color="BFBFBF"/>
+              <w:bottom w:val="single" w:sz="4" w:space="0" w:color="BFBFBF"/>
+              <w:right w:val="single" w:sz="4" w:space="0" w:color="BFBFBF"/>
+            </w:tcBorders>
+            <w:tcMar>
+              <w:top w:w="40" w:type="dxa"/>
+              <w:left w:w="80" w:type="dxa"/>
+              <w:bottom w:w="40" w:type="dxa"/>
+              <w:right w:w="80" w:type="dxa"/>
+            </w:tcMar>
+            <w:vAlign w:val="center"/>
+          </w:tcPr>
+          <w:p>
+            <w:pPr>
+              <w:jc w:val="center"/>
+            </w:pPr>
             <w:r>
               <w:rPr>
                 <w:color w:val="000000"/>
@@ -8856,19 +8970,20 @@
         </w:tc>
         <w:tc>
           <w:tcPr>
-            <w:tcW w:w="3480" w:type="dxa"/>
-            <w:tcBorders>
-              <w:top w:val="single" w:sz="4" w:space="0" w:color="BFBFBF"/>
-              <w:left w:val="single" w:sz="4" w:space="0" w:color="BFBFBF"/>
-              <w:bottom w:val="single" w:sz="4" w:space="0" w:color="BFBFBF"/>
-              <w:right w:val="single" w:sz="4" w:space="0" w:color="BFBFBF"/>
-            </w:tcBorders>
-            <w:tcMar>
-              <w:top w:w="40" w:type="dxa"/>
-              <w:left w:w="80" w:type="dxa"/>
-              <w:bottom w:w="40" w:type="dxa"/>
-              <w:right w:w="80" w:type="dxa"/>
-            </w:tcMar>
+            <w:tcW w:w="5102" w:type="dxa"/>
+            <w:tcBorders>
+              <w:top w:val="single" w:sz="4" w:space="0" w:color="BFBFBF"/>
+              <w:left w:val="single" w:sz="4" w:space="0" w:color="BFBFBF"/>
+              <w:bottom w:val="single" w:sz="4" w:space="0" w:color="BFBFBF"/>
+              <w:right w:val="single" w:sz="4" w:space="0" w:color="BFBFBF"/>
+            </w:tcBorders>
+            <w:tcMar>
+              <w:top w:w="40" w:type="dxa"/>
+              <w:left w:w="80" w:type="dxa"/>
+              <w:bottom w:w="40" w:type="dxa"/>
+              <w:right w:w="80" w:type="dxa"/>
+            </w:tcMar>
+            <w:vAlign w:val="center"/>
           </w:tcPr>
           <w:p>
             <w:r>
@@ -8883,21 +8998,25 @@
         </w:tc>
         <w:tc>
           <w:tcPr>
-            <w:tcW w:w="1900" w:type="dxa"/>
-            <w:tcBorders>
-              <w:top w:val="single" w:sz="4" w:space="0" w:color="BFBFBF"/>
-              <w:left w:val="single" w:sz="4" w:space="0" w:color="BFBFBF"/>
-              <w:bottom w:val="single" w:sz="4" w:space="0" w:color="BFBFBF"/>
-              <w:right w:val="single" w:sz="4" w:space="0" w:color="BFBFBF"/>
-            </w:tcBorders>
-            <w:tcMar>
-              <w:top w:w="40" w:type="dxa"/>
-              <w:left w:w="80" w:type="dxa"/>
-              <w:bottom w:w="40" w:type="dxa"/>
-              <w:right w:w="80" w:type="dxa"/>
-            </w:tcMar>
-          </w:tcPr>
-          <w:p>
+            <w:tcW w:w="1134" w:type="dxa"/>
+            <w:tcBorders>
+              <w:top w:val="single" w:sz="4" w:space="0" w:color="BFBFBF"/>
+              <w:left w:val="single" w:sz="4" w:space="0" w:color="BFBFBF"/>
+              <w:bottom w:val="single" w:sz="4" w:space="0" w:color="BFBFBF"/>
+              <w:right w:val="single" w:sz="4" w:space="0" w:color="BFBFBF"/>
+            </w:tcBorders>
+            <w:tcMar>
+              <w:top w:w="40" w:type="dxa"/>
+              <w:left w:w="80" w:type="dxa"/>
+              <w:bottom w:w="40" w:type="dxa"/>
+              <w:right w:w="80" w:type="dxa"/>
+            </w:tcMar>
+            <w:vAlign w:val="center"/>
+          </w:tcPr>
+          <w:p>
+            <w:pPr>
+              <w:jc w:val="center"/>
+            </w:pPr>
             <w:r>
               <w:rPr>
                 <w:color w:val="000000"/>
@@ -8912,7 +9031,7 @@
       <w:tr>
         <w:tc>
           <w:tcPr>
-            <w:tcW w:w="820" w:type="dxa"/>
+            <w:tcW w:w="671" w:type="dxa"/>
             <w:tcBorders>
               <w:top w:val="single" w:sz="4" w:space="0" w:color="BFBFBF"/>
               <w:left w:val="single" w:sz="4" w:space="0" w:color="BFBFBF"/>
@@ -8926,8 +9045,12 @@
               <w:bottom w:w="40" w:type="dxa"/>
               <w:right w:w="80" w:type="dxa"/>
             </w:tcMar>
-          </w:tcPr>
-          <w:p>
+            <w:vAlign w:val="center"/>
+          </w:tcPr>
+          <w:p>
+            <w:pPr>
+              <w:jc w:val="center"/>
+            </w:pPr>
             <w:r>
               <w:rPr>
                 <w:color w:val="000000"/>
@@ -8940,7 +9063,7 @@
         </w:tc>
         <w:tc>
           <w:tcPr>
-            <w:tcW w:w="1900" w:type="dxa"/>
+            <w:tcW w:w="1739" w:type="dxa"/>
             <w:tcBorders>
               <w:top w:val="single" w:sz="4" w:space="0" w:color="BFBFBF"/>
               <w:left w:val="single" w:sz="4" w:space="0" w:color="BFBFBF"/>
@@ -8954,8 +9077,12 @@
               <w:bottom w:w="40" w:type="dxa"/>
               <w:right w:w="80" w:type="dxa"/>
             </w:tcMar>
-          </w:tcPr>
-          <w:p>
+            <w:vAlign w:val="center"/>
+          </w:tcPr>
+          <w:p>
+            <w:pPr>
+              <w:jc w:val="center"/>
+            </w:pPr>
             <w:r>
               <w:rPr>
                 <w:color w:val="000000"/>
@@ -8968,7 +9095,7 @@
         </w:tc>
         <w:tc>
           <w:tcPr>
-            <w:tcW w:w="1100" w:type="dxa"/>
+            <w:tcW w:w="1026" w:type="dxa"/>
             <w:tcBorders>
               <w:top w:val="single" w:sz="4" w:space="0" w:color="BFBFBF"/>
               <w:left w:val="single" w:sz="4" w:space="0" w:color="BFBFBF"/>
@@ -8982,8 +9109,12 @@
               <w:bottom w:w="40" w:type="dxa"/>
               <w:right w:w="80" w:type="dxa"/>
             </w:tcMar>
-          </w:tcPr>
-          <w:p>
+            <w:vAlign w:val="center"/>
+          </w:tcPr>
+          <w:p>
+            <w:pPr>
+              <w:jc w:val="center"/>
+            </w:pPr>
             <w:r>
               <w:rPr>
                 <w:color w:val="000000"/>
@@ -8996,7 +9127,7 @@
         </w:tc>
         <w:tc>
           <w:tcPr>
-            <w:tcW w:w="3480" w:type="dxa"/>
+            <w:tcW w:w="5102" w:type="dxa"/>
             <w:tcBorders>
               <w:top w:val="single" w:sz="4" w:space="0" w:color="BFBFBF"/>
               <w:left w:val="single" w:sz="4" w:space="0" w:color="BFBFBF"/>
@@ -9010,6 +9141,7 @@
               <w:bottom w:w="40" w:type="dxa"/>
               <w:right w:w="80" w:type="dxa"/>
             </w:tcMar>
+            <w:vAlign w:val="center"/>
           </w:tcPr>
           <w:p>
             <w:r>
@@ -9024,7 +9156,7 @@
         </w:tc>
         <w:tc>
           <w:tcPr>
-            <w:tcW w:w="1900" w:type="dxa"/>
+            <w:tcW w:w="1134" w:type="dxa"/>
             <w:tcBorders>
               <w:top w:val="single" w:sz="4" w:space="0" w:color="BFBFBF"/>
               <w:left w:val="single" w:sz="4" w:space="0" w:color="BFBFBF"/>
@@ -9038,8 +9170,12 @@
               <w:bottom w:w="40" w:type="dxa"/>
               <w:right w:w="80" w:type="dxa"/>
             </w:tcMar>
-          </w:tcPr>
-          <w:p>
+            <w:vAlign w:val="center"/>
+          </w:tcPr>
+          <w:p>
+            <w:pPr>
+              <w:jc w:val="center"/>
+            </w:pPr>
             <w:r>
               <w:rPr>
                 <w:color w:val="000000"/>
@@ -9054,21 +9190,25 @@
       <w:tr>
         <w:tc>
           <w:tcPr>
-            <w:tcW w:w="820" w:type="dxa"/>
-            <w:tcBorders>
-              <w:top w:val="single" w:sz="4" w:space="0" w:color="BFBFBF"/>
-              <w:left w:val="single" w:sz="4" w:space="0" w:color="BFBFBF"/>
-              <w:bottom w:val="single" w:sz="4" w:space="0" w:color="BFBFBF"/>
-              <w:right w:val="single" w:sz="4" w:space="0" w:color="BFBFBF"/>
-            </w:tcBorders>
-            <w:tcMar>
-              <w:top w:w="40" w:type="dxa"/>
-              <w:left w:w="80" w:type="dxa"/>
-              <w:bottom w:w="40" w:type="dxa"/>
-              <w:right w:w="80" w:type="dxa"/>
-            </w:tcMar>
-          </w:tcPr>
-          <w:p>
+            <w:tcW w:w="671" w:type="dxa"/>
+            <w:tcBorders>
+              <w:top w:val="single" w:sz="4" w:space="0" w:color="BFBFBF"/>
+              <w:left w:val="single" w:sz="4" w:space="0" w:color="BFBFBF"/>
+              <w:bottom w:val="single" w:sz="4" w:space="0" w:color="BFBFBF"/>
+              <w:right w:val="single" w:sz="4" w:space="0" w:color="BFBFBF"/>
+            </w:tcBorders>
+            <w:tcMar>
+              <w:top w:w="40" w:type="dxa"/>
+              <w:left w:w="80" w:type="dxa"/>
+              <w:bottom w:w="40" w:type="dxa"/>
+              <w:right w:w="80" w:type="dxa"/>
+            </w:tcMar>
+            <w:vAlign w:val="center"/>
+          </w:tcPr>
+          <w:p>
+            <w:pPr>
+              <w:jc w:val="center"/>
+            </w:pPr>
             <w:r>
               <w:rPr>
                 <w:color w:val="000000"/>
@@ -9081,21 +9221,25 @@
         </w:tc>
         <w:tc>
           <w:tcPr>
-            <w:tcW w:w="1900" w:type="dxa"/>
-            <w:tcBorders>
-              <w:top w:val="single" w:sz="4" w:space="0" w:color="BFBFBF"/>
-              <w:left w:val="single" w:sz="4" w:space="0" w:color="BFBFBF"/>
-              <w:bottom w:val="single" w:sz="4" w:space="0" w:color="BFBFBF"/>
-              <w:right w:val="single" w:sz="4" w:space="0" w:color="BFBFBF"/>
-            </w:tcBorders>
-            <w:tcMar>
-              <w:top w:w="40" w:type="dxa"/>
-              <w:left w:w="80" w:type="dxa"/>
-              <w:bottom w:w="40" w:type="dxa"/>
-              <w:right w:w="80" w:type="dxa"/>
-            </w:tcMar>
-          </w:tcPr>
-          <w:p>
+            <w:tcW w:w="1739" w:type="dxa"/>
+            <w:tcBorders>
+              <w:top w:val="single" w:sz="4" w:space="0" w:color="BFBFBF"/>
+              <w:left w:val="single" w:sz="4" w:space="0" w:color="BFBFBF"/>
+              <w:bottom w:val="single" w:sz="4" w:space="0" w:color="BFBFBF"/>
+              <w:right w:val="single" w:sz="4" w:space="0" w:color="BFBFBF"/>
+            </w:tcBorders>
+            <w:tcMar>
+              <w:top w:w="40" w:type="dxa"/>
+              <w:left w:w="80" w:type="dxa"/>
+              <w:bottom w:w="40" w:type="dxa"/>
+              <w:right w:w="80" w:type="dxa"/>
+            </w:tcMar>
+            <w:vAlign w:val="center"/>
+          </w:tcPr>
+          <w:p>
+            <w:pPr>
+              <w:jc w:val="center"/>
+            </w:pPr>
             <w:r>
               <w:rPr>
                 <w:color w:val="000000"/>
@@ -9108,21 +9252,25 @@
         </w:tc>
         <w:tc>
           <w:tcPr>
-            <w:tcW w:w="1100" w:type="dxa"/>
-            <w:tcBorders>
-              <w:top w:val="single" w:sz="4" w:space="0" w:color="BFBFBF"/>
-              <w:left w:val="single" w:sz="4" w:space="0" w:color="BFBFBF"/>
-              <w:bottom w:val="single" w:sz="4" w:space="0" w:color="BFBFBF"/>
-              <w:right w:val="single" w:sz="4" w:space="0" w:color="BFBFBF"/>
-            </w:tcBorders>
-            <w:tcMar>
-              <w:top w:w="40" w:type="dxa"/>
-              <w:left w:w="80" w:type="dxa"/>
-              <w:bottom w:w="40" w:type="dxa"/>
-              <w:right w:w="80" w:type="dxa"/>
-            </w:tcMar>
-          </w:tcPr>
-          <w:p>
+            <w:tcW w:w="1026" w:type="dxa"/>
+            <w:tcBorders>
+              <w:top w:val="single" w:sz="4" w:space="0" w:color="BFBFBF"/>
+              <w:left w:val="single" w:sz="4" w:space="0" w:color="BFBFBF"/>
+              <w:bottom w:val="single" w:sz="4" w:space="0" w:color="BFBFBF"/>
+              <w:right w:val="single" w:sz="4" w:space="0" w:color="BFBFBF"/>
+            </w:tcBorders>
+            <w:tcMar>
+              <w:top w:w="40" w:type="dxa"/>
+              <w:left w:w="80" w:type="dxa"/>
+              <w:bottom w:w="40" w:type="dxa"/>
+              <w:right w:w="80" w:type="dxa"/>
+            </w:tcMar>
+            <w:vAlign w:val="center"/>
+          </w:tcPr>
+          <w:p>
+            <w:pPr>
+              <w:jc w:val="center"/>
+            </w:pPr>
             <w:r>
               <w:rPr>
                 <w:color w:val="000000"/>
@@ -9135,19 +9283,20 @@
         </w:tc>
         <w:tc>
           <w:tcPr>
-            <w:tcW w:w="3480" w:type="dxa"/>
-            <w:tcBorders>
-              <w:top w:val="single" w:sz="4" w:space="0" w:color="BFBFBF"/>
-              <w:left w:val="single" w:sz="4" w:space="0" w:color="BFBFBF"/>
-              <w:bottom w:val="single" w:sz="4" w:space="0" w:color="BFBFBF"/>
-              <w:right w:val="single" w:sz="4" w:space="0" w:color="BFBFBF"/>
-            </w:tcBorders>
-            <w:tcMar>
-              <w:top w:w="40" w:type="dxa"/>
-              <w:left w:w="80" w:type="dxa"/>
-              <w:bottom w:w="40" w:type="dxa"/>
-              <w:right w:w="80" w:type="dxa"/>
-            </w:tcMar>
+            <w:tcW w:w="5102" w:type="dxa"/>
+            <w:tcBorders>
+              <w:top w:val="single" w:sz="4" w:space="0" w:color="BFBFBF"/>
+              <w:left w:val="single" w:sz="4" w:space="0" w:color="BFBFBF"/>
+              <w:bottom w:val="single" w:sz="4" w:space="0" w:color="BFBFBF"/>
+              <w:right w:val="single" w:sz="4" w:space="0" w:color="BFBFBF"/>
+            </w:tcBorders>
+            <w:tcMar>
+              <w:top w:w="40" w:type="dxa"/>
+              <w:left w:w="80" w:type="dxa"/>
+              <w:bottom w:w="40" w:type="dxa"/>
+              <w:right w:w="80" w:type="dxa"/>
+            </w:tcMar>
+            <w:vAlign w:val="center"/>
           </w:tcPr>
           <w:p>
             <w:r>
@@ -9162,21 +9311,25 @@
         </w:tc>
         <w:tc>
           <w:tcPr>
-            <w:tcW w:w="1900" w:type="dxa"/>
-            <w:tcBorders>
-              <w:top w:val="single" w:sz="4" w:space="0" w:color="BFBFBF"/>
-              <w:left w:val="single" w:sz="4" w:space="0" w:color="BFBFBF"/>
-              <w:bottom w:val="single" w:sz="4" w:space="0" w:color="BFBFBF"/>
-              <w:right w:val="single" w:sz="4" w:space="0" w:color="BFBFBF"/>
-            </w:tcBorders>
-            <w:tcMar>
-              <w:top w:w="40" w:type="dxa"/>
-              <w:left w:w="80" w:type="dxa"/>
-              <w:bottom w:w="40" w:type="dxa"/>
-              <w:right w:w="80" w:type="dxa"/>
-            </w:tcMar>
-          </w:tcPr>
-          <w:p>
+            <w:tcW w:w="1134" w:type="dxa"/>
+            <w:tcBorders>
+              <w:top w:val="single" w:sz="4" w:space="0" w:color="BFBFBF"/>
+              <w:left w:val="single" w:sz="4" w:space="0" w:color="BFBFBF"/>
+              <w:bottom w:val="single" w:sz="4" w:space="0" w:color="BFBFBF"/>
+              <w:right w:val="single" w:sz="4" w:space="0" w:color="BFBFBF"/>
+            </w:tcBorders>
+            <w:tcMar>
+              <w:top w:w="40" w:type="dxa"/>
+              <w:left w:w="80" w:type="dxa"/>
+              <w:bottom w:w="40" w:type="dxa"/>
+              <w:right w:w="80" w:type="dxa"/>
+            </w:tcMar>
+            <w:vAlign w:val="center"/>
+          </w:tcPr>
+          <w:p>
+            <w:pPr>
+              <w:jc w:val="center"/>
+            </w:pPr>
             <w:r>
               <w:rPr>
                 <w:color w:val="000000"/>
@@ -9191,7 +9344,7 @@
       <w:tr>
         <w:tc>
           <w:tcPr>
-            <w:tcW w:w="820" w:type="dxa"/>
+            <w:tcW w:w="671" w:type="dxa"/>
             <w:tcBorders>
               <w:top w:val="single" w:sz="4" w:space="0" w:color="BFBFBF"/>
               <w:left w:val="single" w:sz="4" w:space="0" w:color="BFBFBF"/>
@@ -9205,8 +9358,12 @@
               <w:bottom w:w="40" w:type="dxa"/>
               <w:right w:w="80" w:type="dxa"/>
             </w:tcMar>
-          </w:tcPr>
-          <w:p>
+            <w:vAlign w:val="center"/>
+          </w:tcPr>
+          <w:p>
+            <w:pPr>
+              <w:jc w:val="center"/>
+            </w:pPr>
             <w:r>
               <w:rPr>
                 <w:color w:val="000000"/>
@@ -9219,7 +9376,7 @@
         </w:tc>
         <w:tc>
           <w:tcPr>
-            <w:tcW w:w="1900" w:type="dxa"/>
+            <w:tcW w:w="1739" w:type="dxa"/>
             <w:tcBorders>
               <w:top w:val="single" w:sz="4" w:space="0" w:color="BFBFBF"/>
               <w:left w:val="single" w:sz="4" w:space="0" w:color="BFBFBF"/>
@@ -9233,8 +9390,12 @@
               <w:bottom w:w="40" w:type="dxa"/>
               <w:right w:w="80" w:type="dxa"/>
             </w:tcMar>
-          </w:tcPr>
-          <w:p>
+            <w:vAlign w:val="center"/>
+          </w:tcPr>
+          <w:p>
+            <w:pPr>
+              <w:jc w:val="center"/>
+            </w:pPr>
             <w:r>
               <w:rPr>
                 <w:color w:val="000000"/>
@@ -9247,7 +9408,7 @@
         </w:tc>
         <w:tc>
           <w:tcPr>
-            <w:tcW w:w="1100" w:type="dxa"/>
+            <w:tcW w:w="1026" w:type="dxa"/>
             <w:tcBorders>
               <w:top w:val="single" w:sz="4" w:space="0" w:color="BFBFBF"/>
               <w:left w:val="single" w:sz="4" w:space="0" w:color="BFBFBF"/>
@@ -9261,8 +9422,12 @@
               <w:bottom w:w="40" w:type="dxa"/>
               <w:right w:w="80" w:type="dxa"/>
             </w:tcMar>
-          </w:tcPr>
-          <w:p>
+            <w:vAlign w:val="center"/>
+          </w:tcPr>
+          <w:p>
+            <w:pPr>
+              <w:jc w:val="center"/>
+            </w:pPr>
             <w:r>
               <w:rPr>
                 <w:color w:val="000000"/>
@@ -9275,7 +9440,7 @@
         </w:tc>
         <w:tc>
           <w:tcPr>
-            <w:tcW w:w="3480" w:type="dxa"/>
+            <w:tcW w:w="5102" w:type="dxa"/>
             <w:tcBorders>
               <w:top w:val="single" w:sz="4" w:space="0" w:color="BFBFBF"/>
               <w:left w:val="single" w:sz="4" w:space="0" w:color="BFBFBF"/>
@@ -9289,6 +9454,7 @@
               <w:bottom w:w="40" w:type="dxa"/>
               <w:right w:w="80" w:type="dxa"/>
             </w:tcMar>
+            <w:vAlign w:val="center"/>
           </w:tcPr>
           <w:p>
             <w:r>
@@ -9303,7 +9469,7 @@
         </w:tc>
         <w:tc>
           <w:tcPr>
-            <w:tcW w:w="1900" w:type="dxa"/>
+            <w:tcW w:w="1134" w:type="dxa"/>
             <w:tcBorders>
               <w:top w:val="single" w:sz="4" w:space="0" w:color="BFBFBF"/>
               <w:left w:val="single" w:sz="4" w:space="0" w:color="BFBFBF"/>
@@ -9317,8 +9483,12 @@
               <w:bottom w:w="40" w:type="dxa"/>
               <w:right w:w="80" w:type="dxa"/>
             </w:tcMar>
-          </w:tcPr>
-          <w:p>
+            <w:vAlign w:val="center"/>
+          </w:tcPr>
+          <w:p>
+            <w:pPr>
+              <w:jc w:val="center"/>
+            </w:pPr>
             <w:r>
               <w:rPr>
                 <w:color w:val="000000"/>
@@ -9333,21 +9503,25 @@
       <w:tr>
         <w:tc>
           <w:tcPr>
-            <w:tcW w:w="820" w:type="dxa"/>
-            <w:tcBorders>
-              <w:top w:val="single" w:sz="4" w:space="0" w:color="BFBFBF"/>
-              <w:left w:val="single" w:sz="4" w:space="0" w:color="BFBFBF"/>
-              <w:bottom w:val="single" w:sz="4" w:space="0" w:color="BFBFBF"/>
-              <w:right w:val="single" w:sz="4" w:space="0" w:color="BFBFBF"/>
-            </w:tcBorders>
-            <w:tcMar>
-              <w:top w:w="40" w:type="dxa"/>
-              <w:left w:w="80" w:type="dxa"/>
-              <w:bottom w:w="40" w:type="dxa"/>
-              <w:right w:w="80" w:type="dxa"/>
-            </w:tcMar>
-          </w:tcPr>
-          <w:p>
+            <w:tcW w:w="671" w:type="dxa"/>
+            <w:tcBorders>
+              <w:top w:val="single" w:sz="4" w:space="0" w:color="BFBFBF"/>
+              <w:left w:val="single" w:sz="4" w:space="0" w:color="BFBFBF"/>
+              <w:bottom w:val="single" w:sz="4" w:space="0" w:color="BFBFBF"/>
+              <w:right w:val="single" w:sz="4" w:space="0" w:color="BFBFBF"/>
+            </w:tcBorders>
+            <w:tcMar>
+              <w:top w:w="40" w:type="dxa"/>
+              <w:left w:w="80" w:type="dxa"/>
+              <w:bottom w:w="40" w:type="dxa"/>
+              <w:right w:w="80" w:type="dxa"/>
+            </w:tcMar>
+            <w:vAlign w:val="center"/>
+          </w:tcPr>
+          <w:p>
+            <w:pPr>
+              <w:jc w:val="center"/>
+            </w:pPr>
             <w:r>
               <w:rPr>
                 <w:color w:val="000000"/>
@@ -9360,21 +9534,25 @@
         </w:tc>
         <w:tc>
           <w:tcPr>
-            <w:tcW w:w="1900" w:type="dxa"/>
-            <w:tcBorders>
-              <w:top w:val="single" w:sz="4" w:space="0" w:color="BFBFBF"/>
-              <w:left w:val="single" w:sz="4" w:space="0" w:color="BFBFBF"/>
-              <w:bottom w:val="single" w:sz="4" w:space="0" w:color="BFBFBF"/>
-              <w:right w:val="single" w:sz="4" w:space="0" w:color="BFBFBF"/>
-            </w:tcBorders>
-            <w:tcMar>
-              <w:top w:w="40" w:type="dxa"/>
-              <w:left w:w="80" w:type="dxa"/>
-              <w:bottom w:w="40" w:type="dxa"/>
-              <w:right w:w="80" w:type="dxa"/>
-            </w:tcMar>
-          </w:tcPr>
-          <w:p>
+            <w:tcW w:w="1739" w:type="dxa"/>
+            <w:tcBorders>
+              <w:top w:val="single" w:sz="4" w:space="0" w:color="BFBFBF"/>
+              <w:left w:val="single" w:sz="4" w:space="0" w:color="BFBFBF"/>
+              <w:bottom w:val="single" w:sz="4" w:space="0" w:color="BFBFBF"/>
+              <w:right w:val="single" w:sz="4" w:space="0" w:color="BFBFBF"/>
+            </w:tcBorders>
+            <w:tcMar>
+              <w:top w:w="40" w:type="dxa"/>
+              <w:left w:w="80" w:type="dxa"/>
+              <w:bottom w:w="40" w:type="dxa"/>
+              <w:right w:w="80" w:type="dxa"/>
+            </w:tcMar>
+            <w:vAlign w:val="center"/>
+          </w:tcPr>
+          <w:p>
+            <w:pPr>
+              <w:jc w:val="center"/>
+            </w:pPr>
             <w:r>
               <w:rPr>
                 <w:color w:val="000000"/>
@@ -9387,21 +9565,25 @@
         </w:tc>
         <w:tc>
           <w:tcPr>
-            <w:tcW w:w="1100" w:type="dxa"/>
-            <w:tcBorders>
-              <w:top w:val="single" w:sz="4" w:space="0" w:color="BFBFBF"/>
-              <w:left w:val="single" w:sz="4" w:space="0" w:color="BFBFBF"/>
-              <w:bottom w:val="single" w:sz="4" w:space="0" w:color="BFBFBF"/>
-              <w:right w:val="single" w:sz="4" w:space="0" w:color="BFBFBF"/>
-            </w:tcBorders>
-            <w:tcMar>
-              <w:top w:w="40" w:type="dxa"/>
-              <w:left w:w="80" w:type="dxa"/>
-              <w:bottom w:w="40" w:type="dxa"/>
-              <w:right w:w="80" w:type="dxa"/>
-            </w:tcMar>
-          </w:tcPr>
-          <w:p>
+            <w:tcW w:w="1026" w:type="dxa"/>
+            <w:tcBorders>
+              <w:top w:val="single" w:sz="4" w:space="0" w:color="BFBFBF"/>
+              <w:left w:val="single" w:sz="4" w:space="0" w:color="BFBFBF"/>
+              <w:bottom w:val="single" w:sz="4" w:space="0" w:color="BFBFBF"/>
+              <w:right w:val="single" w:sz="4" w:space="0" w:color="BFBFBF"/>
+            </w:tcBorders>
+            <w:tcMar>
+              <w:top w:w="40" w:type="dxa"/>
+              <w:left w:w="80" w:type="dxa"/>
+              <w:bottom w:w="40" w:type="dxa"/>
+              <w:right w:w="80" w:type="dxa"/>
+            </w:tcMar>
+            <w:vAlign w:val="center"/>
+          </w:tcPr>
+          <w:p>
+            <w:pPr>
+              <w:jc w:val="center"/>
+            </w:pPr>
             <w:r>
               <w:rPr>
                 <w:color w:val="000000"/>
@@ -9414,19 +9596,20 @@
         </w:tc>
         <w:tc>
           <w:tcPr>
-            <w:tcW w:w="3480" w:type="dxa"/>
-            <w:tcBorders>
-              <w:top w:val="single" w:sz="4" w:space="0" w:color="BFBFBF"/>
-              <w:left w:val="single" w:sz="4" w:space="0" w:color="BFBFBF"/>
-              <w:bottom w:val="single" w:sz="4" w:space="0" w:color="BFBFBF"/>
-              <w:right w:val="single" w:sz="4" w:space="0" w:color="BFBFBF"/>
-            </w:tcBorders>
-            <w:tcMar>
-              <w:top w:w="40" w:type="dxa"/>
-              <w:left w:w="80" w:type="dxa"/>
-              <w:bottom w:w="40" w:type="dxa"/>
-              <w:right w:w="80" w:type="dxa"/>
-            </w:tcMar>
+            <w:tcW w:w="5102" w:type="dxa"/>
+            <w:tcBorders>
+              <w:top w:val="single" w:sz="4" w:space="0" w:color="BFBFBF"/>
+              <w:left w:val="single" w:sz="4" w:space="0" w:color="BFBFBF"/>
+              <w:bottom w:val="single" w:sz="4" w:space="0" w:color="BFBFBF"/>
+              <w:right w:val="single" w:sz="4" w:space="0" w:color="BFBFBF"/>
+            </w:tcBorders>
+            <w:tcMar>
+              <w:top w:w="40" w:type="dxa"/>
+              <w:left w:w="80" w:type="dxa"/>
+              <w:bottom w:w="40" w:type="dxa"/>
+              <w:right w:w="80" w:type="dxa"/>
+            </w:tcMar>
+            <w:vAlign w:val="center"/>
           </w:tcPr>
           <w:p>
             <w:r>
@@ -9441,21 +9624,25 @@
         </w:tc>
         <w:tc>
           <w:tcPr>
-            <w:tcW w:w="1900" w:type="dxa"/>
-            <w:tcBorders>
-              <w:top w:val="single" w:sz="4" w:space="0" w:color="BFBFBF"/>
-              <w:left w:val="single" w:sz="4" w:space="0" w:color="BFBFBF"/>
-              <w:bottom w:val="single" w:sz="4" w:space="0" w:color="BFBFBF"/>
-              <w:right w:val="single" w:sz="4" w:space="0" w:color="BFBFBF"/>
-            </w:tcBorders>
-            <w:tcMar>
-              <w:top w:w="40" w:type="dxa"/>
-              <w:left w:w="80" w:type="dxa"/>
-              <w:bottom w:w="40" w:type="dxa"/>
-              <w:right w:w="80" w:type="dxa"/>
-            </w:tcMar>
-          </w:tcPr>
-          <w:p>
+            <w:tcW w:w="1134" w:type="dxa"/>
+            <w:tcBorders>
+              <w:top w:val="single" w:sz="4" w:space="0" w:color="BFBFBF"/>
+              <w:left w:val="single" w:sz="4" w:space="0" w:color="BFBFBF"/>
+              <w:bottom w:val="single" w:sz="4" w:space="0" w:color="BFBFBF"/>
+              <w:right w:val="single" w:sz="4" w:space="0" w:color="BFBFBF"/>
+            </w:tcBorders>
+            <w:tcMar>
+              <w:top w:w="40" w:type="dxa"/>
+              <w:left w:w="80" w:type="dxa"/>
+              <w:bottom w:w="40" w:type="dxa"/>
+              <w:right w:w="80" w:type="dxa"/>
+            </w:tcMar>
+            <w:vAlign w:val="center"/>
+          </w:tcPr>
+          <w:p>
+            <w:pPr>
+              <w:jc w:val="center"/>
+            </w:pPr>
             <w:r>
               <w:rPr>
                 <w:color w:val="000000"/>
@@ -9470,7 +9657,7 @@
       <w:tr>
         <w:tc>
           <w:tcPr>
-            <w:tcW w:w="820" w:type="dxa"/>
+            <w:tcW w:w="671" w:type="dxa"/>
             <w:tcBorders>
               <w:top w:val="single" w:sz="4" w:space="0" w:color="BFBFBF"/>
               <w:left w:val="single" w:sz="4" w:space="0" w:color="BFBFBF"/>
@@ -9484,8 +9671,12 @@
               <w:bottom w:w="40" w:type="dxa"/>
               <w:right w:w="80" w:type="dxa"/>
             </w:tcMar>
-          </w:tcPr>
-          <w:p>
+            <w:vAlign w:val="center"/>
+          </w:tcPr>
+          <w:p>
+            <w:pPr>
+              <w:jc w:val="center"/>
+            </w:pPr>
             <w:r>
               <w:rPr>
                 <w:color w:val="000000"/>
@@ -9498,7 +9689,7 @@
         </w:tc>
         <w:tc>
           <w:tcPr>
-            <w:tcW w:w="1900" w:type="dxa"/>
+            <w:tcW w:w="1739" w:type="dxa"/>
             <w:tcBorders>
               <w:top w:val="single" w:sz="4" w:space="0" w:color="BFBFBF"/>
               <w:left w:val="single" w:sz="4" w:space="0" w:color="BFBFBF"/>
@@ -9512,8 +9703,12 @@
               <w:bottom w:w="40" w:type="dxa"/>
               <w:right w:w="80" w:type="dxa"/>
             </w:tcMar>
-          </w:tcPr>
-          <w:p>
+            <w:vAlign w:val="center"/>
+          </w:tcPr>
+          <w:p>
+            <w:pPr>
+              <w:jc w:val="center"/>
+            </w:pPr>
             <w:r>
               <w:rPr>
                 <w:color w:val="000000"/>
@@ -9526,7 +9721,7 @@
         </w:tc>
         <w:tc>
           <w:tcPr>
-            <w:tcW w:w="1100" w:type="dxa"/>
+            <w:tcW w:w="1026" w:type="dxa"/>
             <w:tcBorders>
               <w:top w:val="single" w:sz="4" w:space="0" w:color="BFBFBF"/>
               <w:left w:val="single" w:sz="4" w:space="0" w:color="BFBFBF"/>
@@ -9540,8 +9735,12 @@
               <w:bottom w:w="40" w:type="dxa"/>
               <w:right w:w="80" w:type="dxa"/>
             </w:tcMar>
-          </w:tcPr>
-          <w:p>
+            <w:vAlign w:val="center"/>
+          </w:tcPr>
+          <w:p>
+            <w:pPr>
+              <w:jc w:val="center"/>
+            </w:pPr>
             <w:r>
               <w:rPr>
                 <w:color w:val="000000"/>
@@ -9554,7 +9753,7 @@
         </w:tc>
         <w:tc>
           <w:tcPr>
-            <w:tcW w:w="3480" w:type="dxa"/>
+            <w:tcW w:w="5102" w:type="dxa"/>
             <w:tcBorders>
               <w:top w:val="single" w:sz="4" w:space="0" w:color="BFBFBF"/>
               <w:left w:val="single" w:sz="4" w:space="0" w:color="BFBFBF"/>
@@ -9568,6 +9767,7 @@
               <w:bottom w:w="40" w:type="dxa"/>
               <w:right w:w="80" w:type="dxa"/>
             </w:tcMar>
+            <w:vAlign w:val="center"/>
           </w:tcPr>
           <w:p>
             <w:r>
@@ -9582,7 +9782,7 @@
         </w:tc>
         <w:tc>
           <w:tcPr>
-            <w:tcW w:w="1900" w:type="dxa"/>
+            <w:tcW w:w="1134" w:type="dxa"/>
             <w:tcBorders>
               <w:top w:val="single" w:sz="4" w:space="0" w:color="BFBFBF"/>
               <w:left w:val="single" w:sz="4" w:space="0" w:color="BFBFBF"/>
@@ -9596,8 +9796,12 @@
               <w:bottom w:w="40" w:type="dxa"/>
               <w:right w:w="80" w:type="dxa"/>
             </w:tcMar>
-          </w:tcPr>
-          <w:p>
+            <w:vAlign w:val="center"/>
+          </w:tcPr>
+          <w:p>
+            <w:pPr>
+              <w:jc w:val="center"/>
+            </w:pPr>
             <w:r>
               <w:rPr>
                 <w:color w:val="000000"/>
@@ -9612,21 +9816,25 @@
       <w:tr>
         <w:tc>
           <w:tcPr>
-            <w:tcW w:w="820" w:type="dxa"/>
-            <w:tcBorders>
-              <w:top w:val="single" w:sz="4" w:space="0" w:color="BFBFBF"/>
-              <w:left w:val="single" w:sz="4" w:space="0" w:color="BFBFBF"/>
-              <w:bottom w:val="single" w:sz="4" w:space="0" w:color="BFBFBF"/>
-              <w:right w:val="single" w:sz="4" w:space="0" w:color="BFBFBF"/>
-            </w:tcBorders>
-            <w:tcMar>
-              <w:top w:w="40" w:type="dxa"/>
-              <w:left w:w="80" w:type="dxa"/>
-              <w:bottom w:w="40" w:type="dxa"/>
-              <w:right w:w="80" w:type="dxa"/>
-            </w:tcMar>
-          </w:tcPr>
-          <w:p>
+            <w:tcW w:w="671" w:type="dxa"/>
+            <w:tcBorders>
+              <w:top w:val="single" w:sz="4" w:space="0" w:color="BFBFBF"/>
+              <w:left w:val="single" w:sz="4" w:space="0" w:color="BFBFBF"/>
+              <w:bottom w:val="single" w:sz="4" w:space="0" w:color="BFBFBF"/>
+              <w:right w:val="single" w:sz="4" w:space="0" w:color="BFBFBF"/>
+            </w:tcBorders>
+            <w:tcMar>
+              <w:top w:w="40" w:type="dxa"/>
+              <w:left w:w="80" w:type="dxa"/>
+              <w:bottom w:w="40" w:type="dxa"/>
+              <w:right w:w="80" w:type="dxa"/>
+            </w:tcMar>
+            <w:vAlign w:val="center"/>
+          </w:tcPr>
+          <w:p>
+            <w:pPr>
+              <w:jc w:val="center"/>
+            </w:pPr>
             <w:r>
               <w:rPr>
                 <w:color w:val="000000"/>
@@ -9639,21 +9847,25 @@
         </w:tc>
         <w:tc>
           <w:tcPr>
-            <w:tcW w:w="1900" w:type="dxa"/>
-            <w:tcBorders>
-              <w:top w:val="single" w:sz="4" w:space="0" w:color="BFBFBF"/>
-              <w:left w:val="single" w:sz="4" w:space="0" w:color="BFBFBF"/>
-              <w:bottom w:val="single" w:sz="4" w:space="0" w:color="BFBFBF"/>
-              <w:right w:val="single" w:sz="4" w:space="0" w:color="BFBFBF"/>
-            </w:tcBorders>
-            <w:tcMar>
-              <w:top w:w="40" w:type="dxa"/>
-              <w:left w:w="80" w:type="dxa"/>
-              <w:bottom w:w="40" w:type="dxa"/>
-              <w:right w:w="80" w:type="dxa"/>
-            </w:tcMar>
-          </w:tcPr>
-          <w:p>
+            <w:tcW w:w="1739" w:type="dxa"/>
+            <w:tcBorders>
+              <w:top w:val="single" w:sz="4" w:space="0" w:color="BFBFBF"/>
+              <w:left w:val="single" w:sz="4" w:space="0" w:color="BFBFBF"/>
+              <w:bottom w:val="single" w:sz="4" w:space="0" w:color="BFBFBF"/>
+              <w:right w:val="single" w:sz="4" w:space="0" w:color="BFBFBF"/>
+            </w:tcBorders>
+            <w:tcMar>
+              <w:top w:w="40" w:type="dxa"/>
+              <w:left w:w="80" w:type="dxa"/>
+              <w:bottom w:w="40" w:type="dxa"/>
+              <w:right w:w="80" w:type="dxa"/>
+            </w:tcMar>
+            <w:vAlign w:val="center"/>
+          </w:tcPr>
+          <w:p>
+            <w:pPr>
+              <w:jc w:val="center"/>
+            </w:pPr>
             <w:r>
               <w:rPr>
                 <w:color w:val="000000"/>
@@ -9666,21 +9878,25 @@
         </w:tc>
         <w:tc>
           <w:tcPr>
-            <w:tcW w:w="1100" w:type="dxa"/>
-            <w:tcBorders>
-              <w:top w:val="single" w:sz="4" w:space="0" w:color="BFBFBF"/>
-              <w:left w:val="single" w:sz="4" w:space="0" w:color="BFBFBF"/>
-              <w:bottom w:val="single" w:sz="4" w:space="0" w:color="BFBFBF"/>
-              <w:right w:val="single" w:sz="4" w:space="0" w:color="BFBFBF"/>
-            </w:tcBorders>
-            <w:tcMar>
-              <w:top w:w="40" w:type="dxa"/>
-              <w:left w:w="80" w:type="dxa"/>
-              <w:bottom w:w="40" w:type="dxa"/>
-              <w:right w:w="80" w:type="dxa"/>
-            </w:tcMar>
-          </w:tcPr>
-          <w:p>
+            <w:tcW w:w="1026" w:type="dxa"/>
+            <w:tcBorders>
+              <w:top w:val="single" w:sz="4" w:space="0" w:color="BFBFBF"/>
+              <w:left w:val="single" w:sz="4" w:space="0" w:color="BFBFBF"/>
+              <w:bottom w:val="single" w:sz="4" w:space="0" w:color="BFBFBF"/>
+              <w:right w:val="single" w:sz="4" w:space="0" w:color="BFBFBF"/>
+            </w:tcBorders>
+            <w:tcMar>
+              <w:top w:w="40" w:type="dxa"/>
+              <w:left w:w="80" w:type="dxa"/>
+              <w:bottom w:w="40" w:type="dxa"/>
+              <w:right w:w="80" w:type="dxa"/>
+            </w:tcMar>
+            <w:vAlign w:val="center"/>
+          </w:tcPr>
+          <w:p>
+            <w:pPr>
+              <w:jc w:val="center"/>
+            </w:pPr>
             <w:r>
               <w:rPr>
                 <w:color w:val="000000"/>
@@ -9693,19 +9909,20 @@
         </w:tc>
         <w:tc>
           <w:tcPr>
-            <w:tcW w:w="3480" w:type="dxa"/>
-            <w:tcBorders>
-              <w:top w:val="single" w:sz="4" w:space="0" w:color="BFBFBF"/>
-              <w:left w:val="single" w:sz="4" w:space="0" w:color="BFBFBF"/>
-              <w:bottom w:val="single" w:sz="4" w:space="0" w:color="BFBFBF"/>
-              <w:right w:val="single" w:sz="4" w:space="0" w:color="BFBFBF"/>
-            </w:tcBorders>
-            <w:tcMar>
-              <w:top w:w="40" w:type="dxa"/>
-              <w:left w:w="80" w:type="dxa"/>
-              <w:bottom w:w="40" w:type="dxa"/>
-              <w:right w:w="80" w:type="dxa"/>
-            </w:tcMar>
+            <w:tcW w:w="5102" w:type="dxa"/>
+            <w:tcBorders>
+              <w:top w:val="single" w:sz="4" w:space="0" w:color="BFBFBF"/>
+              <w:left w:val="single" w:sz="4" w:space="0" w:color="BFBFBF"/>
+              <w:bottom w:val="single" w:sz="4" w:space="0" w:color="BFBFBF"/>
+              <w:right w:val="single" w:sz="4" w:space="0" w:color="BFBFBF"/>
+            </w:tcBorders>
+            <w:tcMar>
+              <w:top w:w="40" w:type="dxa"/>
+              <w:left w:w="80" w:type="dxa"/>
+              <w:bottom w:w="40" w:type="dxa"/>
+              <w:right w:w="80" w:type="dxa"/>
+            </w:tcMar>
+            <w:vAlign w:val="center"/>
           </w:tcPr>
           <w:p>
             <w:r>
@@ -9720,21 +9937,25 @@
         </w:tc>
         <w:tc>
           <w:tcPr>
-            <w:tcW w:w="1900" w:type="dxa"/>
-            <w:tcBorders>
-              <w:top w:val="single" w:sz="4" w:space="0" w:color="BFBFBF"/>
-              <w:left w:val="single" w:sz="4" w:space="0" w:color="BFBFBF"/>
-              <w:bottom w:val="single" w:sz="4" w:space="0" w:color="BFBFBF"/>
-              <w:right w:val="single" w:sz="4" w:space="0" w:color="BFBFBF"/>
-            </w:tcBorders>
-            <w:tcMar>
-              <w:top w:w="40" w:type="dxa"/>
-              <w:left w:w="80" w:type="dxa"/>
-              <w:bottom w:w="40" w:type="dxa"/>
-              <w:right w:w="80" w:type="dxa"/>
-            </w:tcMar>
-          </w:tcPr>
-          <w:p>
+            <w:tcW w:w="1134" w:type="dxa"/>
+            <w:tcBorders>
+              <w:top w:val="single" w:sz="4" w:space="0" w:color="BFBFBF"/>
+              <w:left w:val="single" w:sz="4" w:space="0" w:color="BFBFBF"/>
+              <w:bottom w:val="single" w:sz="4" w:space="0" w:color="BFBFBF"/>
+              <w:right w:val="single" w:sz="4" w:space="0" w:color="BFBFBF"/>
+            </w:tcBorders>
+            <w:tcMar>
+              <w:top w:w="40" w:type="dxa"/>
+              <w:left w:w="80" w:type="dxa"/>
+              <w:bottom w:w="40" w:type="dxa"/>
+              <w:right w:w="80" w:type="dxa"/>
+            </w:tcMar>
+            <w:vAlign w:val="center"/>
+          </w:tcPr>
+          <w:p>
+            <w:pPr>
+              <w:jc w:val="center"/>
+            </w:pPr>
             <w:r>
               <w:rPr>
                 <w:color w:val="000000"/>
@@ -9749,7 +9970,7 @@
       <w:tr>
         <w:tc>
           <w:tcPr>
-            <w:tcW w:w="820" w:type="dxa"/>
+            <w:tcW w:w="671" w:type="dxa"/>
             <w:tcBorders>
               <w:top w:val="single" w:sz="4" w:space="0" w:color="BFBFBF"/>
               <w:left w:val="single" w:sz="4" w:space="0" w:color="BFBFBF"/>
@@ -9763,8 +9984,12 @@
               <w:bottom w:w="40" w:type="dxa"/>
               <w:right w:w="80" w:type="dxa"/>
             </w:tcMar>
-          </w:tcPr>
-          <w:p>
+            <w:vAlign w:val="center"/>
+          </w:tcPr>
+          <w:p>
+            <w:pPr>
+              <w:jc w:val="center"/>
+            </w:pPr>
             <w:r>
               <w:rPr>
                 <w:color w:val="000000"/>
@@ -9777,7 +10002,7 @@
         </w:tc>
         <w:tc>
           <w:tcPr>
-            <w:tcW w:w="1900" w:type="dxa"/>
+            <w:tcW w:w="1739" w:type="dxa"/>
             <w:tcBorders>
               <w:top w:val="single" w:sz="4" w:space="0" w:color="BFBFBF"/>
               <w:left w:val="single" w:sz="4" w:space="0" w:color="BFBFBF"/>
@@ -9791,8 +10016,12 @@
               <w:bottom w:w="40" w:type="dxa"/>
               <w:right w:w="80" w:type="dxa"/>
             </w:tcMar>
-          </w:tcPr>
-          <w:p>
+            <w:vAlign w:val="center"/>
+          </w:tcPr>
+          <w:p>
+            <w:pPr>
+              <w:jc w:val="center"/>
+            </w:pPr>
             <w:r>
               <w:rPr>
                 <w:color w:val="000000"/>
@@ -9805,7 +10034,7 @@
         </w:tc>
         <w:tc>
           <w:tcPr>
-            <w:tcW w:w="1100" w:type="dxa"/>
+            <w:tcW w:w="1026" w:type="dxa"/>
             <w:tcBorders>
               <w:top w:val="single" w:sz="4" w:space="0" w:color="BFBFBF"/>
               <w:left w:val="single" w:sz="4" w:space="0" w:color="BFBFBF"/>
@@ -9819,8 +10048,12 @@
               <w:bottom w:w="40" w:type="dxa"/>
               <w:right w:w="80" w:type="dxa"/>
             </w:tcMar>
-          </w:tcPr>
-          <w:p>
+            <w:vAlign w:val="center"/>
+          </w:tcPr>
+          <w:p>
+            <w:pPr>
+              <w:jc w:val="center"/>
+            </w:pPr>
             <w:r>
               <w:rPr>
                 <w:color w:val="000000"/>
@@ -9833,7 +10066,7 @@
         </w:tc>
         <w:tc>
           <w:tcPr>
-            <w:tcW w:w="3480" w:type="dxa"/>
+            <w:tcW w:w="5102" w:type="dxa"/>
             <w:tcBorders>
               <w:top w:val="single" w:sz="4" w:space="0" w:color="BFBFBF"/>
               <w:left w:val="single" w:sz="4" w:space="0" w:color="BFBFBF"/>
@@ -9847,6 +10080,7 @@
               <w:bottom w:w="40" w:type="dxa"/>
               <w:right w:w="80" w:type="dxa"/>
             </w:tcMar>
+            <w:vAlign w:val="center"/>
           </w:tcPr>
           <w:p>
             <w:r>
@@ -9861,7 +10095,7 @@
         </w:tc>
         <w:tc>
           <w:tcPr>
-            <w:tcW w:w="1900" w:type="dxa"/>
+            <w:tcW w:w="1134" w:type="dxa"/>
             <w:tcBorders>
               <w:top w:val="single" w:sz="4" w:space="0" w:color="BFBFBF"/>
               <w:left w:val="single" w:sz="4" w:space="0" w:color="BFBFBF"/>
@@ -9875,8 +10109,12 @@
               <w:bottom w:w="40" w:type="dxa"/>
               <w:right w:w="80" w:type="dxa"/>
             </w:tcMar>
-          </w:tcPr>
-          <w:p>
+            <w:vAlign w:val="center"/>
+          </w:tcPr>
+          <w:p>
+            <w:pPr>
+              <w:jc w:val="center"/>
+            </w:pPr>
             <w:r>
               <w:rPr>
                 <w:color w:val="000000"/>
@@ -9891,21 +10129,25 @@
       <w:tr>
         <w:tc>
           <w:tcPr>
-            <w:tcW w:w="820" w:type="dxa"/>
-            <w:tcBorders>
-              <w:top w:val="single" w:sz="4" w:space="0" w:color="BFBFBF"/>
-              <w:left w:val="single" w:sz="4" w:space="0" w:color="BFBFBF"/>
-              <w:bottom w:val="single" w:sz="4" w:space="0" w:color="BFBFBF"/>
-              <w:right w:val="single" w:sz="4" w:space="0" w:color="BFBFBF"/>
-            </w:tcBorders>
-            <w:tcMar>
-              <w:top w:w="40" w:type="dxa"/>
-              <w:left w:w="80" w:type="dxa"/>
-              <w:bottom w:w="40" w:type="dxa"/>
-              <w:right w:w="80" w:type="dxa"/>
-            </w:tcMar>
-          </w:tcPr>
-          <w:p>
+            <w:tcW w:w="671" w:type="dxa"/>
+            <w:tcBorders>
+              <w:top w:val="single" w:sz="4" w:space="0" w:color="BFBFBF"/>
+              <w:left w:val="single" w:sz="4" w:space="0" w:color="BFBFBF"/>
+              <w:bottom w:val="single" w:sz="4" w:space="0" w:color="BFBFBF"/>
+              <w:right w:val="single" w:sz="4" w:space="0" w:color="BFBFBF"/>
+            </w:tcBorders>
+            <w:tcMar>
+              <w:top w:w="40" w:type="dxa"/>
+              <w:left w:w="80" w:type="dxa"/>
+              <w:bottom w:w="40" w:type="dxa"/>
+              <w:right w:w="80" w:type="dxa"/>
+            </w:tcMar>
+            <w:vAlign w:val="center"/>
+          </w:tcPr>
+          <w:p>
+            <w:pPr>
+              <w:jc w:val="center"/>
+            </w:pPr>
             <w:r>
               <w:rPr>
                 <w:color w:val="000000"/>
@@ -9918,21 +10160,25 @@
         </w:tc>
         <w:tc>
           <w:tcPr>
-            <w:tcW w:w="1900" w:type="dxa"/>
-            <w:tcBorders>
-              <w:top w:val="single" w:sz="4" w:space="0" w:color="BFBFBF"/>
-              <w:left w:val="single" w:sz="4" w:space="0" w:color="BFBFBF"/>
-              <w:bottom w:val="single" w:sz="4" w:space="0" w:color="BFBFBF"/>
-              <w:right w:val="single" w:sz="4" w:space="0" w:color="BFBFBF"/>
-            </w:tcBorders>
-            <w:tcMar>
-              <w:top w:w="40" w:type="dxa"/>
-              <w:left w:w="80" w:type="dxa"/>
-              <w:bottom w:w="40" w:type="dxa"/>
-              <w:right w:w="80" w:type="dxa"/>
-            </w:tcMar>
-          </w:tcPr>
-          <w:p>
+            <w:tcW w:w="1739" w:type="dxa"/>
+            <w:tcBorders>
+              <w:top w:val="single" w:sz="4" w:space="0" w:color="BFBFBF"/>
+              <w:left w:val="single" w:sz="4" w:space="0" w:color="BFBFBF"/>
+              <w:bottom w:val="single" w:sz="4" w:space="0" w:color="BFBFBF"/>
+              <w:right w:val="single" w:sz="4" w:space="0" w:color="BFBFBF"/>
+            </w:tcBorders>
+            <w:tcMar>
+              <w:top w:w="40" w:type="dxa"/>
+              <w:left w:w="80" w:type="dxa"/>
+              <w:bottom w:w="40" w:type="dxa"/>
+              <w:right w:w="80" w:type="dxa"/>
+            </w:tcMar>
+            <w:vAlign w:val="center"/>
+          </w:tcPr>
+          <w:p>
+            <w:pPr>
+              <w:jc w:val="center"/>
+            </w:pPr>
             <w:r>
               <w:rPr>
                 <w:color w:val="000000"/>
@@ -9945,21 +10191,25 @@
         </w:tc>
         <w:tc>
           <w:tcPr>
-            <w:tcW w:w="1100" w:type="dxa"/>
-            <w:tcBorders>
-              <w:top w:val="single" w:sz="4" w:space="0" w:color="BFBFBF"/>
-              <w:left w:val="single" w:sz="4" w:space="0" w:color="BFBFBF"/>
-              <w:bottom w:val="single" w:sz="4" w:space="0" w:color="BFBFBF"/>
-              <w:right w:val="single" w:sz="4" w:space="0" w:color="BFBFBF"/>
-            </w:tcBorders>
-            <w:tcMar>
-              <w:top w:w="40" w:type="dxa"/>
-              <w:left w:w="80" w:type="dxa"/>
-              <w:bottom w:w="40" w:type="dxa"/>
-              <w:right w:w="80" w:type="dxa"/>
-            </w:tcMar>
-          </w:tcPr>
-          <w:p>
+            <w:tcW w:w="1026" w:type="dxa"/>
+            <w:tcBorders>
+              <w:top w:val="single" w:sz="4" w:space="0" w:color="BFBFBF"/>
+              <w:left w:val="single" w:sz="4" w:space="0" w:color="BFBFBF"/>
+              <w:bottom w:val="single" w:sz="4" w:space="0" w:color="BFBFBF"/>
+              <w:right w:val="single" w:sz="4" w:space="0" w:color="BFBFBF"/>
+            </w:tcBorders>
+            <w:tcMar>
+              <w:top w:w="40" w:type="dxa"/>
+              <w:left w:w="80" w:type="dxa"/>
+              <w:bottom w:w="40" w:type="dxa"/>
+              <w:right w:w="80" w:type="dxa"/>
+            </w:tcMar>
+            <w:vAlign w:val="center"/>
+          </w:tcPr>
+          <w:p>
+            <w:pPr>
+              <w:jc w:val="center"/>
+            </w:pPr>
             <w:r>
               <w:rPr>
                 <w:color w:val="000000"/>
@@ -9972,19 +10222,20 @@
         </w:tc>
         <w:tc>
           <w:tcPr>
-            <w:tcW w:w="3480" w:type="dxa"/>
-            <w:tcBorders>
-              <w:top w:val="single" w:sz="4" w:space="0" w:color="BFBFBF"/>
-              <w:left w:val="single" w:sz="4" w:space="0" w:color="BFBFBF"/>
-              <w:bottom w:val="single" w:sz="4" w:space="0" w:color="BFBFBF"/>
-              <w:right w:val="single" w:sz="4" w:space="0" w:color="BFBFBF"/>
-            </w:tcBorders>
-            <w:tcMar>
-              <w:top w:w="40" w:type="dxa"/>
-              <w:left w:w="80" w:type="dxa"/>
-              <w:bottom w:w="40" w:type="dxa"/>
-              <w:right w:w="80" w:type="dxa"/>
-            </w:tcMar>
+            <w:tcW w:w="5102" w:type="dxa"/>
+            <w:tcBorders>
+              <w:top w:val="single" w:sz="4" w:space="0" w:color="BFBFBF"/>
+              <w:left w:val="single" w:sz="4" w:space="0" w:color="BFBFBF"/>
+              <w:bottom w:val="single" w:sz="4" w:space="0" w:color="BFBFBF"/>
+              <w:right w:val="single" w:sz="4" w:space="0" w:color="BFBFBF"/>
+            </w:tcBorders>
+            <w:tcMar>
+              <w:top w:w="40" w:type="dxa"/>
+              <w:left w:w="80" w:type="dxa"/>
+              <w:bottom w:w="40" w:type="dxa"/>
+              <w:right w:w="80" w:type="dxa"/>
+            </w:tcMar>
+            <w:vAlign w:val="center"/>
           </w:tcPr>
           <w:p>
             <w:r>
@@ -9999,21 +10250,25 @@
         </w:tc>
         <w:tc>
           <w:tcPr>
-            <w:tcW w:w="1900" w:type="dxa"/>
-            <w:tcBorders>
-              <w:top w:val="single" w:sz="4" w:space="0" w:color="BFBFBF"/>
-              <w:left w:val="single" w:sz="4" w:space="0" w:color="BFBFBF"/>
-              <w:bottom w:val="single" w:sz="4" w:space="0" w:color="BFBFBF"/>
-              <w:right w:val="single" w:sz="4" w:space="0" w:color="BFBFBF"/>
-            </w:tcBorders>
-            <w:tcMar>
-              <w:top w:w="40" w:type="dxa"/>
-              <w:left w:w="80" w:type="dxa"/>
-              <w:bottom w:w="40" w:type="dxa"/>
-              <w:right w:w="80" w:type="dxa"/>
-            </w:tcMar>
-          </w:tcPr>
-          <w:p>
+            <w:tcW w:w="1134" w:type="dxa"/>
+            <w:tcBorders>
+              <w:top w:val="single" w:sz="4" w:space="0" w:color="BFBFBF"/>
+              <w:left w:val="single" w:sz="4" w:space="0" w:color="BFBFBF"/>
+              <w:bottom w:val="single" w:sz="4" w:space="0" w:color="BFBFBF"/>
+              <w:right w:val="single" w:sz="4" w:space="0" w:color="BFBFBF"/>
+            </w:tcBorders>
+            <w:tcMar>
+              <w:top w:w="40" w:type="dxa"/>
+              <w:left w:w="80" w:type="dxa"/>
+              <w:bottom w:w="40" w:type="dxa"/>
+              <w:right w:w="80" w:type="dxa"/>
+            </w:tcMar>
+            <w:vAlign w:val="center"/>
+          </w:tcPr>
+          <w:p>
+            <w:pPr>
+              <w:jc w:val="center"/>
+            </w:pPr>
             <w:r>
               <w:rPr>
                 <w:color w:val="000000"/>
@@ -10028,7 +10283,7 @@
       <w:tr>
         <w:tc>
           <w:tcPr>
-            <w:tcW w:w="820" w:type="dxa"/>
+            <w:tcW w:w="671" w:type="dxa"/>
             <w:tcBorders>
               <w:top w:val="single" w:sz="4" w:space="0" w:color="BFBFBF"/>
               <w:left w:val="single" w:sz="4" w:space="0" w:color="BFBFBF"/>
@@ -10042,8 +10297,12 @@
               <w:bottom w:w="40" w:type="dxa"/>
               <w:right w:w="80" w:type="dxa"/>
             </w:tcMar>
-          </w:tcPr>
-          <w:p>
+            <w:vAlign w:val="center"/>
+          </w:tcPr>
+          <w:p>
+            <w:pPr>
+              <w:jc w:val="center"/>
+            </w:pPr>
             <w:r>
               <w:rPr>
                 <w:color w:val="000000"/>
@@ -10056,7 +10315,7 @@
         </w:tc>
         <w:tc>
           <w:tcPr>
-            <w:tcW w:w="1900" w:type="dxa"/>
+            <w:tcW w:w="1739" w:type="dxa"/>
             <w:tcBorders>
               <w:top w:val="single" w:sz="4" w:space="0" w:color="BFBFBF"/>
               <w:left w:val="single" w:sz="4" w:space="0" w:color="BFBFBF"/>
@@ -10070,8 +10329,12 @@
               <w:bottom w:w="40" w:type="dxa"/>
               <w:right w:w="80" w:type="dxa"/>
             </w:tcMar>
-          </w:tcPr>
-          <w:p>
+            <w:vAlign w:val="center"/>
+          </w:tcPr>
+          <w:p>
+            <w:pPr>
+              <w:jc w:val="center"/>
+            </w:pPr>
             <w:r>
               <w:rPr>
                 <w:color w:val="000000"/>
@@ -10084,7 +10347,7 @@
         </w:tc>
         <w:tc>
           <w:tcPr>
-            <w:tcW w:w="1100" w:type="dxa"/>
+            <w:tcW w:w="1026" w:type="dxa"/>
             <w:tcBorders>
               <w:top w:val="single" w:sz="4" w:space="0" w:color="BFBFBF"/>
               <w:left w:val="single" w:sz="4" w:space="0" w:color="BFBFBF"/>
@@ -10098,8 +10361,12 @@
               <w:bottom w:w="40" w:type="dxa"/>
               <w:right w:w="80" w:type="dxa"/>
             </w:tcMar>
-          </w:tcPr>
-          <w:p>
+            <w:vAlign w:val="center"/>
+          </w:tcPr>
+          <w:p>
+            <w:pPr>
+              <w:jc w:val="center"/>
+            </w:pPr>
             <w:r>
               <w:rPr>
                 <w:color w:val="000000"/>
@@ -10112,7 +10379,7 @@
         </w:tc>
         <w:tc>
           <w:tcPr>
-            <w:tcW w:w="3480" w:type="dxa"/>
+            <w:tcW w:w="5102" w:type="dxa"/>
             <w:tcBorders>
               <w:top w:val="single" w:sz="4" w:space="0" w:color="BFBFBF"/>
               <w:left w:val="single" w:sz="4" w:space="0" w:color="BFBFBF"/>
@@ -10126,6 +10393,7 @@
               <w:bottom w:w="40" w:type="dxa"/>
               <w:right w:w="80" w:type="dxa"/>
             </w:tcMar>
+            <w:vAlign w:val="center"/>
           </w:tcPr>
           <w:p>
             <w:r>
@@ -10140,7 +10408,7 @@
         </w:tc>
         <w:tc>
           <w:tcPr>
-            <w:tcW w:w="1900" w:type="dxa"/>
+            <w:tcW w:w="1134" w:type="dxa"/>
             <w:tcBorders>
               <w:top w:val="single" w:sz="4" w:space="0" w:color="BFBFBF"/>
               <w:left w:val="single" w:sz="4" w:space="0" w:color="BFBFBF"/>
@@ -10154,8 +10422,12 @@
               <w:bottom w:w="40" w:type="dxa"/>
               <w:right w:w="80" w:type="dxa"/>
             </w:tcMar>
-          </w:tcPr>
-          <w:p>
+            <w:vAlign w:val="center"/>
+          </w:tcPr>
+          <w:p>
+            <w:pPr>
+              <w:jc w:val="center"/>
+            </w:pPr>
             <w:r>
               <w:rPr>
                 <w:color w:val="000000"/>
@@ -10170,7 +10442,7 @@
       <w:tr>
         <w:tc>
           <w:tcPr>
-            <w:tcW w:w="820" w:type="dxa"/>
+            <w:tcW w:w="671" w:type="dxa"/>
             <w:tcBorders>
               <w:top w:val="single" w:sz="4" w:space="0" w:color="BFBFBF"/>
               <w:left w:val="single" w:sz="4" w:space="0" w:color="BFBFBF"/>
@@ -10184,8 +10456,12 @@
               <w:bottom w:w="40" w:type="dxa"/>
               <w:right w:w="80" w:type="dxa"/>
             </w:tcMar>
-          </w:tcPr>
-          <w:p>
+            <w:vAlign w:val="center"/>
+          </w:tcPr>
+          <w:p>
+            <w:pPr>
+              <w:jc w:val="center"/>
+            </w:pPr>
             <w:r>
               <w:rPr>
                 <w:color w:val="000000"/>
@@ -10198,7 +10474,7 @@
         </w:tc>
         <w:tc>
           <w:tcPr>
-            <w:tcW w:w="1900" w:type="dxa"/>
+            <w:tcW w:w="1739" w:type="dxa"/>
             <w:tcBorders>
               <w:top w:val="single" w:sz="4" w:space="0" w:color="BFBFBF"/>
               <w:left w:val="single" w:sz="4" w:space="0" w:color="BFBFBF"/>
@@ -10212,8 +10488,12 @@
               <w:bottom w:w="40" w:type="dxa"/>
               <w:right w:w="80" w:type="dxa"/>
             </w:tcMar>
-          </w:tcPr>
-          <w:p>
+            <w:vAlign w:val="center"/>
+          </w:tcPr>
+          <w:p>
+            <w:pPr>
+              <w:jc w:val="center"/>
+            </w:pPr>
             <w:r>
               <w:rPr>
                 <w:color w:val="000000"/>
@@ -10226,7 +10506,7 @@
         </w:tc>
         <w:tc>
           <w:tcPr>
-            <w:tcW w:w="1100" w:type="dxa"/>
+            <w:tcW w:w="1026" w:type="dxa"/>
             <w:tcBorders>
               <w:top w:val="single" w:sz="4" w:space="0" w:color="BFBFBF"/>
               <w:left w:val="single" w:sz="4" w:space="0" w:color="BFBFBF"/>
@@ -10240,8 +10520,12 @@
               <w:bottom w:w="40" w:type="dxa"/>
               <w:right w:w="80" w:type="dxa"/>
             </w:tcMar>
-          </w:tcPr>
-          <w:p>
+            <w:vAlign w:val="center"/>
+          </w:tcPr>
+          <w:p>
+            <w:pPr>
+              <w:jc w:val="center"/>
+            </w:pPr>
             <w:r>
               <w:rPr>
                 <w:color w:val="000000"/>
@@ -10254,7 +10538,7 @@
         </w:tc>
         <w:tc>
           <w:tcPr>
-            <w:tcW w:w="3480" w:type="dxa"/>
+            <w:tcW w:w="5102" w:type="dxa"/>
             <w:tcBorders>
               <w:top w:val="single" w:sz="4" w:space="0" w:color="BFBFBF"/>
               <w:left w:val="single" w:sz="4" w:space="0" w:color="BFBFBF"/>
@@ -10268,30 +10552,22 @@
               <w:bottom w:w="40" w:type="dxa"/>
               <w:right w:w="80" w:type="dxa"/>
             </w:tcMar>
-          </w:tcPr>
-          <w:p>
-            <w:r>
-              <w:rPr>
-                <w:color w:val="000000"/>
-                <w:sz w:val="18"/>
-                <w:szCs w:val="18"/>
-              </w:rPr>
-              <w:t xml:space="preserve">Web Community (/community) and Admin (/admin) pages exist and render, but have no navigation </w:t>
-            </w:r>
-            <w:r>
-              <w:rPr>
-                <w:color w:val="000000"/>
-                <w:sz w:val="18"/>
-                <w:szCs w:val="18"/>
-              </w:rPr>
-              <w:lastRenderedPageBreak/>
-              <w:t>links/buttons anywhere in the UI — reachable only by manually entering the URL, so users cannot discover them.</w:t>
-            </w:r>
-          </w:p>
-        </w:tc>
-        <w:tc>
-          <w:tcPr>
-            <w:tcW w:w="1900" w:type="dxa"/>
+            <w:vAlign w:val="center"/>
+          </w:tcPr>
+          <w:p>
+            <w:r>
+              <w:rPr>
+                <w:color w:val="000000"/>
+                <w:sz w:val="18"/>
+                <w:szCs w:val="18"/>
+              </w:rPr>
+              <w:t>Web Community (/community) and Admin (/admin) pages exist and render, but have no navigation links/buttons anywhere in the UI — reachable only by manually entering the URL, so users cannot discover them.</w:t>
+            </w:r>
+          </w:p>
+        </w:tc>
+        <w:tc>
+          <w:tcPr>
+            <w:tcW w:w="1134" w:type="dxa"/>
             <w:tcBorders>
               <w:top w:val="single" w:sz="4" w:space="0" w:color="BFBFBF"/>
               <w:left w:val="single" w:sz="4" w:space="0" w:color="BFBFBF"/>
@@ -10305,15 +10581,18 @@
               <w:bottom w:w="40" w:type="dxa"/>
               <w:right w:w="80" w:type="dxa"/>
             </w:tcMar>
-          </w:tcPr>
-          <w:p>
-            <w:r>
-              <w:rPr>
-                <w:color w:val="000000"/>
-                <w:sz w:val="18"/>
-                <w:szCs w:val="18"/>
-              </w:rPr>
-              <w:lastRenderedPageBreak/>
+            <w:vAlign w:val="center"/>
+          </w:tcPr>
+          <w:p>
+            <w:pPr>
+              <w:jc w:val="center"/>
+            </w:pPr>
+            <w:r>
+              <w:rPr>
+                <w:color w:val="000000"/>
+                <w:sz w:val="18"/>
+                <w:szCs w:val="18"/>
+              </w:rPr>
               <w:t>Open</w:t>
             </w:r>
           </w:p>
@@ -10328,7 +10607,7 @@
     </w:p>
     <w:sectPr>
       <w:pgSz w:w="12240" w:h="15840"/>
-      <w:pgMar w:top="513" w:right="1440" w:bottom="1440" w:left="1440" w:header="680" w:footer="0" w:gutter="0"/>
+      <w:pgMar w:top="513" w:right="877" w:bottom="1440" w:left="1440" w:header="680" w:footer="0" w:gutter="0"/>
       <w:cols w:space="720"/>
       <w:docGrid w:linePitch="360"/>
     </w:sectPr>

</xml_diff>